<commit_message>
punto 2 memoria acabado
</commit_message>
<xml_diff>
--- a/memoria/Lectio.docx
+++ b/memoria/Lectio.docx
@@ -6,10 +6,10 @@
       <mc:Choice Requires="v"/>
       <mc:Fallback>
         <w:drawing>
-          <wp:inline distT="0" distB="0" distL="0" distR="0" wp14:anchorId="031FC148" wp14:editId="744691B6">
+          <wp:inline distT="0" distB="0" distL="0" distR="0" wp14:anchorId="378F0717" wp14:editId="050FCE48">
             <wp:extent cx="635" cy="635"/>
             <wp:effectExtent l="0" t="0" r="0" b="0"/>
-            <wp:docPr id="1859064463" name="Rectangle 1">
+            <wp:docPr id="1287949746" name="Rectangle 1">
               <a:extLst xmlns:a="http://purl.oclc.org/ooxml/drawingml/main">
                 <a:ext uri="{A998136B-4AC2-44c3-8CCF-79AB77ABDD1D}">
                   <a15:backgroundPr xmlns:a15="http://schemas.microsoft.com/office/drawing/2012/main" bwMode="white" bwPure="auto" bwNormal="auto" targetScreenSize="1024x768"/>
@@ -726,7 +726,7 @@
             <w:noProof/>
             <w:webHidden/>
           </w:rPr>
-          <w:t>2</w:t>
+          <w:t>3</w:t>
         </w:r>
         <w:r>
           <w:rPr>
@@ -818,7 +818,7 @@
             <w:noProof/>
             <w:webHidden/>
           </w:rPr>
-          <w:t>2</w:t>
+          <w:t>3</w:t>
         </w:r>
         <w:r>
           <w:rPr>
@@ -910,7 +910,7 @@
             <w:noProof/>
             <w:webHidden/>
           </w:rPr>
-          <w:t>2</w:t>
+          <w:t>3</w:t>
         </w:r>
         <w:r>
           <w:rPr>
@@ -1002,7 +1002,7 @@
             <w:noProof/>
             <w:webHidden/>
           </w:rPr>
-          <w:t>2</w:t>
+          <w:t>3</w:t>
         </w:r>
         <w:r>
           <w:rPr>
@@ -1094,7 +1094,7 @@
             <w:noProof/>
             <w:webHidden/>
           </w:rPr>
-          <w:t>3</w:t>
+          <w:t>4</w:t>
         </w:r>
         <w:r>
           <w:rPr>
@@ -1186,7 +1186,7 @@
             <w:noProof/>
             <w:webHidden/>
           </w:rPr>
-          <w:t>3</w:t>
+          <w:t>4</w:t>
         </w:r>
         <w:r>
           <w:rPr>
@@ -1278,7 +1278,7 @@
             <w:noProof/>
             <w:webHidden/>
           </w:rPr>
-          <w:t>4</w:t>
+          <w:t>5</w:t>
         </w:r>
         <w:r>
           <w:rPr>
@@ -1370,7 +1370,7 @@
             <w:noProof/>
             <w:webHidden/>
           </w:rPr>
-          <w:t>4</w:t>
+          <w:t>5</w:t>
         </w:r>
         <w:r>
           <w:rPr>
@@ -1462,7 +1462,7 @@
             <w:noProof/>
             <w:webHidden/>
           </w:rPr>
-          <w:t>5</w:t>
+          <w:t>6</w:t>
         </w:r>
         <w:r>
           <w:rPr>
@@ -1554,7 +1554,7 @@
             <w:noProof/>
             <w:webHidden/>
           </w:rPr>
-          <w:t>6</w:t>
+          <w:t>7</w:t>
         </w:r>
         <w:r>
           <w:rPr>
@@ -1646,7 +1646,7 @@
             <w:noProof/>
             <w:webHidden/>
           </w:rPr>
-          <w:t>6</w:t>
+          <w:t>7</w:t>
         </w:r>
         <w:r>
           <w:rPr>
@@ -1738,7 +1738,7 @@
             <w:noProof/>
             <w:webHidden/>
           </w:rPr>
-          <w:t>10</w:t>
+          <w:t>11</w:t>
         </w:r>
         <w:r>
           <w:rPr>
@@ -2014,7 +2014,7 @@
             <w:noProof/>
             <w:webHidden/>
           </w:rPr>
-          <w:t>14</w:t>
+          <w:t>15</w:t>
         </w:r>
         <w:r>
           <w:rPr>
@@ -2118,23 +2118,835 @@
       </w:hyperlink>
     </w:p>
     <w:p>
+      <w:pPr>
+        <w:widowControl/>
+        <w:suppressAutoHyphens w:val="0"/>
+      </w:pPr>
       <w:r>
         <w:fldChar w:fldCharType="end"/>
       </w:r>
+    </w:p>
+    <w:p>
+      <w:pPr>
+        <w:widowControl/>
+        <w:suppressAutoHyphens w:val="0"/>
+        <w:rPr>
+          <w:rFonts w:ascii="Cambria" w:eastAsia="Times New Roman" w:hAnsi="Cambria" w:cs="Times New Roman"/>
+          <w:b/>
+          <w:bCs/>
+          <w:color w:val="365F91"/>
+          <w:kern w:val="0"/>
+          <w:sz w:val="28"/>
+          <w:szCs w:val="28"/>
+          <w:lang w:eastAsia="en-US" w:bidi="ar-SA"/>
+        </w:rPr>
+      </w:pPr>
+      <w:r>
+        <w:br w:type="page"/>
+      </w:r>
+    </w:p>
+    <w:p>
+      <w:pPr>
+        <w:pStyle w:val="TtulodeTDC"/>
+      </w:pPr>
+      <w:r>
+        <w:lastRenderedPageBreak/>
+        <w:t xml:space="preserve">Índice de </w:t>
+      </w:r>
+      <w:r>
+        <w:t>ilustraciones</w:t>
+      </w:r>
+    </w:p>
+    <w:p>
+      <w:pPr>
+        <w:pStyle w:val="Tabladeilustraciones"/>
+        <w:tabs>
+          <w:tab w:val="end" w:leader="dot" w:pos="516.90pt"/>
+        </w:tabs>
+        <w:rPr>
+          <w:rFonts w:asciiTheme="minorHAnsi" w:eastAsiaTheme="minorEastAsia" w:hAnsiTheme="minorHAnsi" w:cstheme="minorBidi"/>
+          <w:noProof/>
+          <w:kern w:val="2"/>
+          <w:szCs w:val="24"/>
+          <w:lang w:eastAsia="es-ES" w:bidi="ar-SA"/>
+          <w14:ligatures w14:val="standardContextual"/>
+        </w:rPr>
+      </w:pPr>
+      <w:r>
+        <w:rPr>
+          <w:rFonts w:ascii="Cambria" w:eastAsia="Times New Roman" w:hAnsi="Cambria" w:cs="Times New Roman"/>
+          <w:b/>
+          <w:bCs/>
+          <w:color w:val="365F91"/>
+          <w:kern w:val="0"/>
+          <w:sz w:val="28"/>
+          <w:szCs w:val="28"/>
+          <w:lang w:eastAsia="en-US" w:bidi="ar-SA"/>
+        </w:rPr>
+        <w:fldChar w:fldCharType="begin"/>
+      </w:r>
+      <w:r>
+        <w:rPr>
+          <w:rFonts w:ascii="Cambria" w:eastAsia="Times New Roman" w:hAnsi="Cambria" w:cs="Times New Roman"/>
+          <w:b/>
+          <w:bCs/>
+          <w:color w:val="365F91"/>
+          <w:kern w:val="0"/>
+          <w:sz w:val="28"/>
+          <w:szCs w:val="28"/>
+          <w:lang w:eastAsia="en-US" w:bidi="ar-SA"/>
+        </w:rPr>
+        <w:instrText xml:space="preserve"> TOC \h \z \c "Ilustración" </w:instrText>
+      </w:r>
+      <w:r>
+        <w:rPr>
+          <w:rFonts w:ascii="Cambria" w:eastAsia="Times New Roman" w:hAnsi="Cambria" w:cs="Times New Roman"/>
+          <w:b/>
+          <w:bCs/>
+          <w:color w:val="365F91"/>
+          <w:kern w:val="0"/>
+          <w:sz w:val="28"/>
+          <w:szCs w:val="28"/>
+          <w:lang w:eastAsia="en-US" w:bidi="ar-SA"/>
+        </w:rPr>
+        <w:fldChar w:fldCharType="separate"/>
+      </w:r>
+      <w:hyperlink w:anchor="_Toc215561186" w:history="1">
+        <w:r>
+          <w:rPr>
+            <w:rStyle w:val="Hipervnculo"/>
+            <w:b/>
+            <w:bCs/>
+            <w:noProof/>
+          </w:rPr>
+          <w:t>Ilustración 1.</w:t>
+        </w:r>
+        <w:r>
+          <w:rPr>
+            <w:rStyle w:val="Hipervnculo"/>
+            <w:noProof/>
+          </w:rPr>
+          <w:t xml:space="preserve"> Organización de tareas y Sprints en la herramienta de gestión.</w:t>
+        </w:r>
+        <w:r>
+          <w:rPr>
+            <w:noProof/>
+            <w:webHidden/>
+          </w:rPr>
+          <w:tab/>
+        </w:r>
+        <w:r>
+          <w:rPr>
+            <w:noProof/>
+            <w:webHidden/>
+          </w:rPr>
+          <w:fldChar w:fldCharType="begin"/>
+        </w:r>
+        <w:r>
+          <w:rPr>
+            <w:noProof/>
+            <w:webHidden/>
+          </w:rPr>
+          <w:instrText xml:space="preserve"> PAGEREF _Toc215561186 \h </w:instrText>
+        </w:r>
+        <w:r>
+          <w:rPr>
+            <w:noProof/>
+            <w:webHidden/>
+          </w:rPr>
+        </w:r>
+        <w:r>
+          <w:rPr>
+            <w:noProof/>
+            <w:webHidden/>
+          </w:rPr>
+          <w:fldChar w:fldCharType="separate"/>
+        </w:r>
+        <w:r>
+          <w:rPr>
+            <w:noProof/>
+            <w:webHidden/>
+          </w:rPr>
+          <w:t>13</w:t>
+        </w:r>
+        <w:r>
+          <w:rPr>
+            <w:noProof/>
+            <w:webHidden/>
+          </w:rPr>
+          <w:fldChar w:fldCharType="end"/>
+        </w:r>
+      </w:hyperlink>
+    </w:p>
+    <w:p>
+      <w:pPr>
+        <w:pStyle w:val="Tabladeilustraciones"/>
+        <w:tabs>
+          <w:tab w:val="end" w:leader="dot" w:pos="516.90pt"/>
+        </w:tabs>
+        <w:rPr>
+          <w:rFonts w:asciiTheme="minorHAnsi" w:eastAsiaTheme="minorEastAsia" w:hAnsiTheme="minorHAnsi" w:cstheme="minorBidi"/>
+          <w:noProof/>
+          <w:kern w:val="2"/>
+          <w:szCs w:val="24"/>
+          <w:lang w:eastAsia="es-ES" w:bidi="ar-SA"/>
+          <w14:ligatures w14:val="standardContextual"/>
+        </w:rPr>
+      </w:pPr>
+      <w:hyperlink w:anchor="_Toc215561187" w:history="1">
+        <w:r>
+          <w:rPr>
+            <w:rStyle w:val="Hipervnculo"/>
+            <w:b/>
+            <w:bCs/>
+            <w:noProof/>
+          </w:rPr>
+          <w:t>Ilustración 2.</w:t>
+        </w:r>
+        <w:r>
+          <w:rPr>
+            <w:rStyle w:val="Hipervnculo"/>
+            <w:noProof/>
+          </w:rPr>
+          <w:t xml:space="preserve"> Cronograma temporal de fases del proyecto Lectio.</w:t>
+        </w:r>
+        <w:r>
+          <w:rPr>
+            <w:noProof/>
+            <w:webHidden/>
+          </w:rPr>
+          <w:tab/>
+        </w:r>
+        <w:r>
+          <w:rPr>
+            <w:noProof/>
+            <w:webHidden/>
+          </w:rPr>
+          <w:fldChar w:fldCharType="begin"/>
+        </w:r>
+        <w:r>
+          <w:rPr>
+            <w:noProof/>
+            <w:webHidden/>
+          </w:rPr>
+          <w:instrText xml:space="preserve"> PAGEREF _Toc215561187 \h </w:instrText>
+        </w:r>
+        <w:r>
+          <w:rPr>
+            <w:noProof/>
+            <w:webHidden/>
+          </w:rPr>
+        </w:r>
+        <w:r>
+          <w:rPr>
+            <w:noProof/>
+            <w:webHidden/>
+          </w:rPr>
+          <w:fldChar w:fldCharType="separate"/>
+        </w:r>
+        <w:r>
+          <w:rPr>
+            <w:noProof/>
+            <w:webHidden/>
+          </w:rPr>
+          <w:t>14</w:t>
+        </w:r>
+        <w:r>
+          <w:rPr>
+            <w:noProof/>
+            <w:webHidden/>
+          </w:rPr>
+          <w:fldChar w:fldCharType="end"/>
+        </w:r>
+      </w:hyperlink>
+    </w:p>
+    <w:p>
+      <w:pPr>
+        <w:widowControl/>
+        <w:suppressAutoHyphens w:val="0"/>
+        <w:rPr>
+          <w:rFonts w:ascii="Cambria" w:eastAsia="Times New Roman" w:hAnsi="Cambria" w:cs="Times New Roman"/>
+          <w:b/>
+          <w:bCs/>
+          <w:color w:val="365F91"/>
+          <w:kern w:val="0"/>
+          <w:sz w:val="28"/>
+          <w:szCs w:val="28"/>
+          <w:lang w:eastAsia="en-US" w:bidi="ar-SA"/>
+        </w:rPr>
+      </w:pPr>
+      <w:r>
+        <w:rPr>
+          <w:rFonts w:ascii="Cambria" w:eastAsia="Times New Roman" w:hAnsi="Cambria" w:cs="Times New Roman"/>
+          <w:b/>
+          <w:bCs/>
+          <w:color w:val="365F91"/>
+          <w:kern w:val="0"/>
+          <w:sz w:val="28"/>
+          <w:szCs w:val="28"/>
+          <w:lang w:eastAsia="en-US" w:bidi="ar-SA"/>
+        </w:rPr>
+        <w:fldChar w:fldCharType="end"/>
+      </w:r>
+    </w:p>
+    <w:p>
+      <w:pPr>
+        <w:widowControl/>
+        <w:suppressAutoHyphens w:val="0"/>
+        <w:rPr>
+          <w:rFonts w:ascii="Cambria" w:eastAsia="Times New Roman" w:hAnsi="Cambria" w:cs="Times New Roman"/>
+          <w:b/>
+          <w:bCs/>
+          <w:color w:val="365F91"/>
+          <w:kern w:val="0"/>
+          <w:sz w:val="28"/>
+          <w:szCs w:val="28"/>
+          <w:lang w:eastAsia="en-US" w:bidi="ar-SA"/>
+        </w:rPr>
+      </w:pPr>
+      <w:r>
+        <w:br w:type="page"/>
+      </w:r>
+    </w:p>
+    <w:p>
+      <w:pPr>
+        <w:pStyle w:val="TtulodeTDC"/>
+      </w:pPr>
+      <w:r>
+        <w:lastRenderedPageBreak/>
+        <w:t xml:space="preserve">Índice de </w:t>
+      </w:r>
+      <w:r>
+        <w:t>tablas</w:t>
+      </w:r>
+    </w:p>
+    <w:p>
+      <w:pPr>
+        <w:pStyle w:val="Tabladeilustraciones"/>
+        <w:tabs>
+          <w:tab w:val="end" w:leader="dot" w:pos="516.90pt"/>
+        </w:tabs>
+        <w:rPr>
+          <w:rFonts w:asciiTheme="minorHAnsi" w:eastAsiaTheme="minorEastAsia" w:hAnsiTheme="minorHAnsi" w:cstheme="minorBidi"/>
+          <w:noProof/>
+          <w:kern w:val="2"/>
+          <w:szCs w:val="24"/>
+          <w:lang w:eastAsia="es-ES" w:bidi="ar-SA"/>
+          <w14:ligatures w14:val="standardContextual"/>
+        </w:rPr>
+      </w:pPr>
+      <w:r>
+        <w:fldChar w:fldCharType="begin"/>
+      </w:r>
+      <w:r>
+        <w:instrText xml:space="preserve"> TOC \h \z \c "Tabla" </w:instrText>
+      </w:r>
+      <w:r>
+        <w:fldChar w:fldCharType="separate"/>
+      </w:r>
+      <w:hyperlink w:anchor="_Toc215560159" w:history="1">
+        <w:r>
+          <w:rPr>
+            <w:rStyle w:val="Hipervnculo"/>
+            <w:b/>
+            <w:bCs/>
+            <w:noProof/>
+          </w:rPr>
+          <w:t>Tabla 1.</w:t>
+        </w:r>
+        <w:r>
+          <w:rPr>
+            <w:rStyle w:val="Hipervnculo"/>
+            <w:noProof/>
+          </w:rPr>
+          <w:t xml:space="preserve"> </w:t>
+        </w:r>
+        <w:r>
+          <w:rPr>
+            <w:rStyle w:val="Hipervnculo"/>
+            <w:smallCaps/>
+            <w:noProof/>
+          </w:rPr>
+          <w:t>Historias de usuario</w:t>
+        </w:r>
+        <w:r>
+          <w:rPr>
+            <w:noProof/>
+            <w:webHidden/>
+          </w:rPr>
+          <w:tab/>
+        </w:r>
+        <w:r>
+          <w:rPr>
+            <w:noProof/>
+            <w:webHidden/>
+          </w:rPr>
+          <w:fldChar w:fldCharType="begin"/>
+        </w:r>
+        <w:r>
+          <w:rPr>
+            <w:noProof/>
+            <w:webHidden/>
+          </w:rPr>
+          <w:instrText xml:space="preserve"> PAGEREF _Toc215560159 \h </w:instrText>
+        </w:r>
+        <w:r>
+          <w:rPr>
+            <w:noProof/>
+            <w:webHidden/>
+          </w:rPr>
+        </w:r>
+        <w:r>
+          <w:rPr>
+            <w:noProof/>
+            <w:webHidden/>
+          </w:rPr>
+          <w:fldChar w:fldCharType="separate"/>
+        </w:r>
+        <w:r>
+          <w:rPr>
+            <w:noProof/>
+            <w:webHidden/>
+          </w:rPr>
+          <w:t>11</w:t>
+        </w:r>
+        <w:r>
+          <w:rPr>
+            <w:noProof/>
+            <w:webHidden/>
+          </w:rPr>
+          <w:fldChar w:fldCharType="end"/>
+        </w:r>
+      </w:hyperlink>
+    </w:p>
+    <w:p>
+      <w:pPr>
+        <w:pStyle w:val="Tabladeilustraciones"/>
+        <w:tabs>
+          <w:tab w:val="end" w:leader="dot" w:pos="516.90pt"/>
+        </w:tabs>
+        <w:rPr>
+          <w:rFonts w:asciiTheme="minorHAnsi" w:eastAsiaTheme="minorEastAsia" w:hAnsiTheme="minorHAnsi" w:cstheme="minorBidi"/>
+          <w:noProof/>
+          <w:kern w:val="2"/>
+          <w:szCs w:val="24"/>
+          <w:lang w:eastAsia="es-ES" w:bidi="ar-SA"/>
+          <w14:ligatures w14:val="standardContextual"/>
+        </w:rPr>
+      </w:pPr>
+      <w:hyperlink w:anchor="_Toc215560160" w:history="1">
+        <w:r>
+          <w:rPr>
+            <w:rStyle w:val="Hipervnculo"/>
+            <w:b/>
+            <w:bCs/>
+            <w:noProof/>
+          </w:rPr>
+          <w:t>Tabla 2.</w:t>
+        </w:r>
+        <w:r>
+          <w:rPr>
+            <w:rStyle w:val="Hipervnculo"/>
+            <w:noProof/>
+          </w:rPr>
+          <w:t xml:space="preserve"> Desglose de Tareas y Subtareas</w:t>
+        </w:r>
+        <w:r>
+          <w:rPr>
+            <w:noProof/>
+            <w:webHidden/>
+          </w:rPr>
+          <w:tab/>
+        </w:r>
+        <w:r>
+          <w:rPr>
+            <w:noProof/>
+            <w:webHidden/>
+          </w:rPr>
+          <w:fldChar w:fldCharType="begin"/>
+        </w:r>
+        <w:r>
+          <w:rPr>
+            <w:noProof/>
+            <w:webHidden/>
+          </w:rPr>
+          <w:instrText xml:space="preserve"> PAGEREF _Toc215560160 \h </w:instrText>
+        </w:r>
+        <w:r>
+          <w:rPr>
+            <w:noProof/>
+            <w:webHidden/>
+          </w:rPr>
+        </w:r>
+        <w:r>
+          <w:rPr>
+            <w:noProof/>
+            <w:webHidden/>
+          </w:rPr>
+          <w:fldChar w:fldCharType="separate"/>
+        </w:r>
+        <w:r>
+          <w:rPr>
+            <w:noProof/>
+            <w:webHidden/>
+          </w:rPr>
+          <w:t>13</w:t>
+        </w:r>
+        <w:r>
+          <w:rPr>
+            <w:noProof/>
+            <w:webHidden/>
+          </w:rPr>
+          <w:fldChar w:fldCharType="end"/>
+        </w:r>
+      </w:hyperlink>
+    </w:p>
+    <w:p>
+      <w:pPr>
+        <w:pStyle w:val="Tabladeilustraciones"/>
+        <w:tabs>
+          <w:tab w:val="end" w:leader="dot" w:pos="516.90pt"/>
+        </w:tabs>
+        <w:rPr>
+          <w:rFonts w:asciiTheme="minorHAnsi" w:eastAsiaTheme="minorEastAsia" w:hAnsiTheme="minorHAnsi" w:cstheme="minorBidi"/>
+          <w:noProof/>
+          <w:kern w:val="2"/>
+          <w:szCs w:val="24"/>
+          <w:lang w:eastAsia="es-ES" w:bidi="ar-SA"/>
+          <w14:ligatures w14:val="standardContextual"/>
+        </w:rPr>
+      </w:pPr>
+      <w:hyperlink w:anchor="_Toc215560161" w:history="1">
+        <w:r>
+          <w:rPr>
+            <w:rStyle w:val="Hipervnculo"/>
+            <w:b/>
+            <w:bCs/>
+            <w:noProof/>
+          </w:rPr>
+          <w:t>Tabla 3.</w:t>
+        </w:r>
+        <w:r>
+          <w:rPr>
+            <w:rStyle w:val="Hipervnculo"/>
+            <w:noProof/>
+          </w:rPr>
+          <w:t xml:space="preserve"> Resumen de Tareas Generales</w:t>
+        </w:r>
+        <w:r>
+          <w:rPr>
+            <w:noProof/>
+            <w:webHidden/>
+          </w:rPr>
+          <w:tab/>
+        </w:r>
+        <w:r>
+          <w:rPr>
+            <w:noProof/>
+            <w:webHidden/>
+          </w:rPr>
+          <w:fldChar w:fldCharType="begin"/>
+        </w:r>
+        <w:r>
+          <w:rPr>
+            <w:noProof/>
+            <w:webHidden/>
+          </w:rPr>
+          <w:instrText xml:space="preserve"> PAGEREF _Toc215560161 \h </w:instrText>
+        </w:r>
+        <w:r>
+          <w:rPr>
+            <w:noProof/>
+            <w:webHidden/>
+          </w:rPr>
+        </w:r>
+        <w:r>
+          <w:rPr>
+            <w:noProof/>
+            <w:webHidden/>
+          </w:rPr>
+          <w:fldChar w:fldCharType="separate"/>
+        </w:r>
+        <w:r>
+          <w:rPr>
+            <w:noProof/>
+            <w:webHidden/>
+          </w:rPr>
+          <w:t>14</w:t>
+        </w:r>
+        <w:r>
+          <w:rPr>
+            <w:noProof/>
+            <w:webHidden/>
+          </w:rPr>
+          <w:fldChar w:fldCharType="end"/>
+        </w:r>
+      </w:hyperlink>
+    </w:p>
+    <w:p>
+      <w:pPr>
+        <w:pStyle w:val="Tabladeilustraciones"/>
+        <w:tabs>
+          <w:tab w:val="end" w:leader="dot" w:pos="516.90pt"/>
+        </w:tabs>
+        <w:rPr>
+          <w:rFonts w:asciiTheme="minorHAnsi" w:eastAsiaTheme="minorEastAsia" w:hAnsiTheme="minorHAnsi" w:cstheme="minorBidi"/>
+          <w:noProof/>
+          <w:kern w:val="2"/>
+          <w:szCs w:val="24"/>
+          <w:lang w:eastAsia="es-ES" w:bidi="ar-SA"/>
+          <w14:ligatures w14:val="standardContextual"/>
+        </w:rPr>
+      </w:pPr>
+      <w:hyperlink w:anchor="_Toc215560162" w:history="1">
+        <w:r>
+          <w:rPr>
+            <w:rStyle w:val="Hipervnculo"/>
+            <w:b/>
+            <w:bCs/>
+            <w:noProof/>
+          </w:rPr>
+          <w:t>Tabla 4.</w:t>
+        </w:r>
+        <w:r>
+          <w:rPr>
+            <w:rStyle w:val="Hipervnculo"/>
+            <w:noProof/>
+          </w:rPr>
+          <w:t xml:space="preserve"> Costes fijos mensual</w:t>
+        </w:r>
+        <w:r>
+          <w:rPr>
+            <w:noProof/>
+            <w:webHidden/>
+          </w:rPr>
+          <w:tab/>
+        </w:r>
+        <w:r>
+          <w:rPr>
+            <w:noProof/>
+            <w:webHidden/>
+          </w:rPr>
+          <w:fldChar w:fldCharType="begin"/>
+        </w:r>
+        <w:r>
+          <w:rPr>
+            <w:noProof/>
+            <w:webHidden/>
+          </w:rPr>
+          <w:instrText xml:space="preserve"> PAGEREF _Toc215560162 \h </w:instrText>
+        </w:r>
+        <w:r>
+          <w:rPr>
+            <w:noProof/>
+            <w:webHidden/>
+          </w:rPr>
+        </w:r>
+        <w:r>
+          <w:rPr>
+            <w:noProof/>
+            <w:webHidden/>
+          </w:rPr>
+          <w:fldChar w:fldCharType="separate"/>
+        </w:r>
+        <w:r>
+          <w:rPr>
+            <w:noProof/>
+            <w:webHidden/>
+          </w:rPr>
+          <w:t>15</w:t>
+        </w:r>
+        <w:r>
+          <w:rPr>
+            <w:noProof/>
+            <w:webHidden/>
+          </w:rPr>
+          <w:fldChar w:fldCharType="end"/>
+        </w:r>
+      </w:hyperlink>
+    </w:p>
+    <w:p>
+      <w:pPr>
+        <w:pStyle w:val="Tabladeilustraciones"/>
+        <w:tabs>
+          <w:tab w:val="end" w:leader="dot" w:pos="516.90pt"/>
+        </w:tabs>
+        <w:rPr>
+          <w:rFonts w:asciiTheme="minorHAnsi" w:eastAsiaTheme="minorEastAsia" w:hAnsiTheme="minorHAnsi" w:cstheme="minorBidi"/>
+          <w:noProof/>
+          <w:kern w:val="2"/>
+          <w:szCs w:val="24"/>
+          <w:lang w:eastAsia="es-ES" w:bidi="ar-SA"/>
+          <w14:ligatures w14:val="standardContextual"/>
+        </w:rPr>
+      </w:pPr>
+      <w:hyperlink w:anchor="_Toc215560163" w:history="1">
+        <w:r>
+          <w:rPr>
+            <w:rStyle w:val="Hipervnculo"/>
+            <w:b/>
+            <w:bCs/>
+            <w:noProof/>
+          </w:rPr>
+          <w:t>Tabla 5.</w:t>
+        </w:r>
+        <w:r>
+          <w:rPr>
+            <w:rStyle w:val="Hipervnculo"/>
+            <w:noProof/>
+          </w:rPr>
+          <w:t xml:space="preserve"> Costes fijos anuales</w:t>
+        </w:r>
+        <w:r>
+          <w:rPr>
+            <w:noProof/>
+            <w:webHidden/>
+          </w:rPr>
+          <w:tab/>
+        </w:r>
+        <w:r>
+          <w:rPr>
+            <w:noProof/>
+            <w:webHidden/>
+          </w:rPr>
+          <w:fldChar w:fldCharType="begin"/>
+        </w:r>
+        <w:r>
+          <w:rPr>
+            <w:noProof/>
+            <w:webHidden/>
+          </w:rPr>
+          <w:instrText xml:space="preserve"> PAGEREF _Toc215560163 \h </w:instrText>
+        </w:r>
+        <w:r>
+          <w:rPr>
+            <w:noProof/>
+            <w:webHidden/>
+          </w:rPr>
+        </w:r>
+        <w:r>
+          <w:rPr>
+            <w:noProof/>
+            <w:webHidden/>
+          </w:rPr>
+          <w:fldChar w:fldCharType="separate"/>
+        </w:r>
+        <w:r>
+          <w:rPr>
+            <w:noProof/>
+            <w:webHidden/>
+          </w:rPr>
+          <w:t>15</w:t>
+        </w:r>
+        <w:r>
+          <w:rPr>
+            <w:noProof/>
+            <w:webHidden/>
+          </w:rPr>
+          <w:fldChar w:fldCharType="end"/>
+        </w:r>
+      </w:hyperlink>
+    </w:p>
+    <w:p>
+      <w:pPr>
+        <w:pStyle w:val="Tabladeilustraciones"/>
+        <w:tabs>
+          <w:tab w:val="end" w:leader="dot" w:pos="516.90pt"/>
+        </w:tabs>
+        <w:rPr>
+          <w:rFonts w:asciiTheme="minorHAnsi" w:eastAsiaTheme="minorEastAsia" w:hAnsiTheme="minorHAnsi" w:cstheme="minorBidi"/>
+          <w:noProof/>
+          <w:kern w:val="2"/>
+          <w:szCs w:val="24"/>
+          <w:lang w:eastAsia="es-ES" w:bidi="ar-SA"/>
+          <w14:ligatures w14:val="standardContextual"/>
+        </w:rPr>
+      </w:pPr>
+      <w:hyperlink w:anchor="_Toc215560164" w:history="1">
+        <w:r>
+          <w:rPr>
+            <w:rStyle w:val="Hipervnculo"/>
+            <w:b/>
+            <w:bCs/>
+            <w:noProof/>
+          </w:rPr>
+          <w:t>Tabla 6.</w:t>
+        </w:r>
+        <w:r>
+          <w:rPr>
+            <w:rStyle w:val="Hipervnculo"/>
+            <w:noProof/>
+          </w:rPr>
+          <w:t xml:space="preserve"> Costes variables</w:t>
+        </w:r>
+        <w:r>
+          <w:rPr>
+            <w:noProof/>
+            <w:webHidden/>
+          </w:rPr>
+          <w:tab/>
+        </w:r>
+        <w:r>
+          <w:rPr>
+            <w:noProof/>
+            <w:webHidden/>
+          </w:rPr>
+          <w:fldChar w:fldCharType="begin"/>
+        </w:r>
+        <w:r>
+          <w:rPr>
+            <w:noProof/>
+            <w:webHidden/>
+          </w:rPr>
+          <w:instrText xml:space="preserve"> PAGEREF _Toc215560164 \h </w:instrText>
+        </w:r>
+        <w:r>
+          <w:rPr>
+            <w:noProof/>
+            <w:webHidden/>
+          </w:rPr>
+        </w:r>
+        <w:r>
+          <w:rPr>
+            <w:noProof/>
+            <w:webHidden/>
+          </w:rPr>
+          <w:fldChar w:fldCharType="separate"/>
+        </w:r>
+        <w:r>
+          <w:rPr>
+            <w:noProof/>
+            <w:webHidden/>
+          </w:rPr>
+          <w:t>15</w:t>
+        </w:r>
+        <w:r>
+          <w:rPr>
+            <w:noProof/>
+            <w:webHidden/>
+          </w:rPr>
+          <w:fldChar w:fldCharType="end"/>
+        </w:r>
+      </w:hyperlink>
+    </w:p>
+    <w:p>
+      <w:r>
+        <w:rPr>
+          <w:rFonts w:ascii="Calibri" w:hAnsi="Calibri" w:cs="Mangal"/>
+        </w:rPr>
+        <w:fldChar w:fldCharType="end"/>
+      </w:r>
+    </w:p>
+    <w:p>
+      <w:pPr>
+        <w:pStyle w:val="TtulodeTDC"/>
+      </w:pPr>
     </w:p>
     <w:p/>
-    <w:p/>
     <w:p>
       <w:pPr>
-        <w:contextualSpacing/>
-        <w:rPr>
-          <w:rFonts w:ascii="Calibri" w:hAnsi="Calibri"/>
-        </w:rPr>
-      </w:pPr>
-    </w:p>
-    <w:p>
-      <w:pPr>
-        <w:contextualSpacing/>
+        <w:widowControl/>
+        <w:suppressAutoHyphens w:val="0"/>
         <w:rPr>
           <w:rFonts w:ascii="Calibri" w:hAnsi="Calibri"/>
         </w:rPr>
@@ -2150,36 +2962,42 @@
         <w:br w:type="page"/>
       </w:r>
       <w:bookmarkStart w:id="0" w:name="_Toc215211633"/>
+      <w:bookmarkStart w:id="1" w:name="_Toc215559162"/>
       <w:r>
         <w:lastRenderedPageBreak/>
         <w:t>Descripción del proyect</w:t>
       </w:r>
-      <w:bookmarkStart w:id="1" w:name="_Toc426654771"/>
-      <w:bookmarkStart w:id="2" w:name="_Toc440219712"/>
+      <w:bookmarkStart w:id="2" w:name="_Toc426654771"/>
+      <w:bookmarkStart w:id="3" w:name="_Toc440219712"/>
       <w:r>
         <w:t>o</w:t>
       </w:r>
       <w:bookmarkEnd w:id="0"/>
+      <w:bookmarkEnd w:id="1"/>
     </w:p>
     <w:p>
       <w:pPr>
         <w:pStyle w:val="Ttulo2"/>
       </w:pPr>
-      <w:bookmarkStart w:id="3" w:name="_Toc215211634"/>
+      <w:bookmarkStart w:id="4" w:name="_Toc215211634"/>
+      <w:bookmarkStart w:id="5" w:name="_Toc215559163"/>
       <w:r>
         <w:t>Contexto del proyecto</w:t>
       </w:r>
-      <w:bookmarkEnd w:id="3"/>
+      <w:bookmarkEnd w:id="4"/>
+      <w:bookmarkEnd w:id="5"/>
     </w:p>
     <w:p>
       <w:pPr>
         <w:pStyle w:val="Ttulo3"/>
       </w:pPr>
-      <w:bookmarkStart w:id="4" w:name="_Toc215211635"/>
+      <w:bookmarkStart w:id="6" w:name="_Toc215211635"/>
+      <w:bookmarkStart w:id="7" w:name="_Toc215559164"/>
       <w:r>
         <w:t>Ámbito y entorno</w:t>
       </w:r>
-      <w:bookmarkEnd w:id="4"/>
+      <w:bookmarkEnd w:id="6"/>
+      <w:bookmarkEnd w:id="7"/>
     </w:p>
     <w:p>
       <w:pPr>
@@ -2196,7 +3014,23 @@
           <w:rFonts w:ascii="Calibri" w:hAnsi="Calibri" w:cs="Calibri"/>
           <w:lang w:eastAsia="es-ES" w:bidi="ar-SA"/>
         </w:rPr>
-        <w:t>El proyecto Lectio se desarrolla en un ámbito de la gestión y comercialización digital de libros. En un contexto donde el consumo de contenido digital esta en constante crecimiento y donde las librerías tradicionales se enfrentan al desafío de adaptarse a las nuevas formas de acceso a la lectura.</w:t>
+        <w:t xml:space="preserve">El proyecto Lectio se desarrolla en un ámbito de la gestión y comercialización digital de libros. En un contexto donde el consumo de contenido digital </w:t>
+      </w:r>
+      <w:proofErr w:type="spellStart"/>
+      <w:r>
+        <w:rPr>
+          <w:rFonts w:ascii="Calibri" w:hAnsi="Calibri" w:cs="Calibri"/>
+          <w:lang w:eastAsia="es-ES" w:bidi="ar-SA"/>
+        </w:rPr>
+        <w:t>esta</w:t>
+      </w:r>
+      <w:proofErr w:type="spellEnd"/>
+      <w:r>
+        <w:rPr>
+          <w:rFonts w:ascii="Calibri" w:hAnsi="Calibri" w:cs="Calibri"/>
+          <w:lang w:eastAsia="es-ES" w:bidi="ar-SA"/>
+        </w:rPr>
+        <w:t xml:space="preserve"> en constante crecimiento y donde las librerías tradicionales se enfrentan al desafío de adaptarse a las nuevas formas de acceso a la lectura.</w:t>
       </w:r>
     </w:p>
     <w:p>
@@ -2253,11 +3087,13 @@
       <w:pPr>
         <w:pStyle w:val="Ttulo3"/>
       </w:pPr>
-      <w:bookmarkStart w:id="5" w:name="_Toc215211636"/>
+      <w:bookmarkStart w:id="8" w:name="_Toc215211636"/>
+      <w:bookmarkStart w:id="9" w:name="_Toc215559165"/>
       <w:r>
         <w:t>Análisis de la realidad</w:t>
       </w:r>
-      <w:bookmarkEnd w:id="5"/>
+      <w:bookmarkEnd w:id="8"/>
+      <w:bookmarkEnd w:id="9"/>
     </w:p>
     <w:p>
       <w:pPr>
@@ -2397,18 +3233,34 @@
           <w:rFonts w:ascii="Calibri" w:hAnsi="Calibri" w:cs="Calibri"/>
           <w:lang w:eastAsia="es-ES" w:bidi="ar-SA"/>
         </w:rPr>
-        <w:t>Por tanto, se identifica la necesidad de una herramienta web que permita gestionar un catalogo amplio, ofrecer múltiples formatos del mismo libro y garantizar una experiencia de usuario ágil, atractiva y segura.</w:t>
+        <w:t xml:space="preserve">Por tanto, se identifica la necesidad de una herramienta web que permita gestionar un </w:t>
+      </w:r>
+      <w:r>
+        <w:rPr>
+          <w:rFonts w:ascii="Calibri" w:hAnsi="Calibri" w:cs="Calibri"/>
+          <w:lang w:eastAsia="es-ES" w:bidi="ar-SA"/>
+        </w:rPr>
+        <w:t>catálogo</w:t>
+      </w:r>
+      <w:r>
+        <w:rPr>
+          <w:rFonts w:ascii="Calibri" w:hAnsi="Calibri" w:cs="Calibri"/>
+          <w:lang w:eastAsia="es-ES" w:bidi="ar-SA"/>
+        </w:rPr>
+        <w:t xml:space="preserve"> amplio, ofrecer múltiples formatos del mismo libro y garantizar una experiencia de usuario ágil, atractiva y segura.</w:t>
       </w:r>
     </w:p>
     <w:p>
       <w:pPr>
         <w:pStyle w:val="Ttulo3"/>
       </w:pPr>
-      <w:bookmarkStart w:id="6" w:name="_Toc215211637"/>
+      <w:bookmarkStart w:id="10" w:name="_Toc215211637"/>
+      <w:bookmarkStart w:id="11" w:name="_Toc215559166"/>
       <w:r>
         <w:t>Solución y justificación de la solución propuesta</w:t>
       </w:r>
-      <w:bookmarkEnd w:id="6"/>
+      <w:bookmarkEnd w:id="10"/>
+      <w:bookmarkEnd w:id="11"/>
     </w:p>
     <w:p>
       <w:pPr>
@@ -2504,11 +3356,13 @@
       <w:pPr>
         <w:pStyle w:val="Ttulo3"/>
       </w:pPr>
-      <w:bookmarkStart w:id="7" w:name="_Toc215211638"/>
+      <w:bookmarkStart w:id="12" w:name="_Toc215211638"/>
+      <w:bookmarkStart w:id="13" w:name="_Toc215559167"/>
       <w:r>
         <w:t>Destinatarios de vuestra herramienta</w:t>
       </w:r>
-      <w:bookmarkEnd w:id="7"/>
+      <w:bookmarkEnd w:id="12"/>
+      <w:bookmarkEnd w:id="13"/>
     </w:p>
     <w:p>
       <w:pPr>
@@ -2641,14 +3495,16 @@
       <w:pPr>
         <w:pStyle w:val="Ttulo2"/>
       </w:pPr>
-      <w:bookmarkStart w:id="8" w:name="_Toc215211639"/>
+      <w:bookmarkStart w:id="14" w:name="_Toc215211639"/>
+      <w:bookmarkStart w:id="15" w:name="_Toc215559168"/>
       <w:r>
         <w:t>Objetivo del proyecto</w:t>
       </w:r>
       <w:r>
         <w:t xml:space="preserve"> (en castellano)</w:t>
       </w:r>
-      <w:bookmarkEnd w:id="8"/>
+      <w:bookmarkEnd w:id="14"/>
+      <w:bookmarkEnd w:id="15"/>
     </w:p>
     <w:p>
       <w:pPr>
@@ -2767,7 +3623,23 @@
           <w:rFonts w:ascii="Calibri" w:hAnsi="Calibri" w:cs="Calibri"/>
           <w:lang w:eastAsia="es-ES" w:bidi="ar-SA"/>
         </w:rPr>
-        <w:t>Desarrollar un panel de administración que permita gestionar el gatalogo, usuarios, pedidos y formatos disponibles.</w:t>
+        <w:t xml:space="preserve">Desarrollar un panel de administración que permita gestionar el </w:t>
+      </w:r>
+      <w:proofErr w:type="spellStart"/>
+      <w:r>
+        <w:rPr>
+          <w:rFonts w:ascii="Calibri" w:hAnsi="Calibri" w:cs="Calibri"/>
+          <w:lang w:eastAsia="es-ES" w:bidi="ar-SA"/>
+        </w:rPr>
+        <w:t>gatalogo</w:t>
+      </w:r>
+      <w:proofErr w:type="spellEnd"/>
+      <w:r>
+        <w:rPr>
+          <w:rFonts w:ascii="Calibri" w:hAnsi="Calibri" w:cs="Calibri"/>
+          <w:lang w:eastAsia="es-ES" w:bidi="ar-SA"/>
+        </w:rPr>
+        <w:t>, usuarios, pedidos y formatos disponibles.</w:t>
       </w:r>
     </w:p>
     <w:p>
@@ -2850,11 +3722,13 @@
       <w:pPr>
         <w:pStyle w:val="Ttulo2"/>
       </w:pPr>
-      <w:bookmarkStart w:id="9" w:name="_Toc215211640"/>
+      <w:bookmarkStart w:id="16" w:name="_Toc215211640"/>
+      <w:bookmarkStart w:id="17" w:name="_Toc215559169"/>
       <w:r>
         <w:t>Objetivo del proyecto (en inglés)</w:t>
       </w:r>
-      <w:bookmarkEnd w:id="9"/>
+      <w:bookmarkEnd w:id="16"/>
+      <w:bookmarkEnd w:id="17"/>
     </w:p>
     <w:p>
       <w:pPr>
@@ -3092,12 +3966,21 @@
           <w:lang w:eastAsia="es-ES" w:bidi="ar-SA"/>
         </w:rPr>
       </w:pPr>
+      <w:proofErr w:type="spellStart"/>
       <w:r>
         <w:rPr>
           <w:rFonts w:ascii="Calibri" w:hAnsi="Calibri" w:cs="Calibri"/>
           <w:lang w:eastAsia="es-ES" w:bidi="ar-SA"/>
         </w:rPr>
-        <w:t>Overall, this project seeks to provide an innovative technological solution that enhances access to culture and supports the digital evolution of libraries and bookstores.</w:t>
+        <w:t>Overall</w:t>
+      </w:r>
+      <w:proofErr w:type="spellEnd"/>
+      <w:r>
+        <w:rPr>
+          <w:rFonts w:ascii="Calibri" w:hAnsi="Calibri" w:cs="Calibri"/>
+          <w:lang w:eastAsia="es-ES" w:bidi="ar-SA"/>
+        </w:rPr>
+        <w:t>, this project seeks to provide an innovative technological solution that enhances access to culture and supports the digital evolution of libraries and bookstores.</w:t>
       </w:r>
     </w:p>
     <w:p>
@@ -3122,11 +4005,13 @@
       <w:pPr>
         <w:pStyle w:val="Ttulo2"/>
       </w:pPr>
-      <w:bookmarkStart w:id="10" w:name="_Toc215211641"/>
+      <w:bookmarkStart w:id="18" w:name="_Toc215211641"/>
+      <w:bookmarkStart w:id="19" w:name="_Toc215559170"/>
       <w:r>
         <w:t>Marco legal (si procede)</w:t>
       </w:r>
-      <w:bookmarkEnd w:id="10"/>
+      <w:bookmarkEnd w:id="18"/>
+      <w:bookmarkEnd w:id="19"/>
     </w:p>
     <w:p>
       <w:pPr>
@@ -3267,12 +4152,14 @@
         <w:pStyle w:val="Ttulo1"/>
         <w:ind w:start="35.85pt"/>
       </w:pPr>
-      <w:bookmarkStart w:id="11" w:name="_Toc215211642"/>
+      <w:bookmarkStart w:id="20" w:name="_Toc215211642"/>
+      <w:bookmarkStart w:id="21" w:name="_Toc215559171"/>
       <w:r>
         <w:lastRenderedPageBreak/>
         <w:t>Acuerdo del Proyecto</w:t>
       </w:r>
-      <w:bookmarkEnd w:id="11"/>
+      <w:bookmarkEnd w:id="20"/>
+      <w:bookmarkEnd w:id="21"/>
     </w:p>
     <w:p>
       <w:pPr>
@@ -3281,13 +4168,15 @@
       <w:r>
         <w:t xml:space="preserve"> </w:t>
       </w:r>
-      <w:bookmarkStart w:id="12" w:name="_Toc215211643"/>
+      <w:bookmarkStart w:id="22" w:name="_Toc215211643"/>
+      <w:bookmarkStart w:id="23" w:name="_Toc215559172"/>
       <w:r>
         <w:t>Historias de usuario</w:t>
       </w:r>
-      <w:bookmarkEnd w:id="1"/>
       <w:bookmarkEnd w:id="2"/>
-      <w:bookmarkEnd w:id="12"/>
+      <w:bookmarkEnd w:id="3"/>
+      <w:bookmarkEnd w:id="22"/>
+      <w:bookmarkEnd w:id="23"/>
     </w:p>
     <w:p>
       <w:pPr>
@@ -3333,7 +4222,7 @@
                 <w:szCs w:val="24"/>
               </w:rPr>
             </w:pPr>
-            <w:bookmarkStart w:id="13" w:name="_Hlk215164583"/>
+            <w:bookmarkStart w:id="24" w:name="_Hlk215164583"/>
             <w:r>
               <w:rPr>
                 <w:rFonts w:asciiTheme="minorHAnsi" w:hAnsiTheme="minorHAnsi" w:cstheme="minorHAnsi"/>
@@ -3412,7 +4301,7 @@
                 <w:rFonts w:asciiTheme="minorHAnsi" w:hAnsiTheme="minorHAnsi" w:cstheme="minorHAnsi"/>
                 <w:szCs w:val="24"/>
               </w:rPr>
-              <w:t>LEC-9</w:t>
+              <w:t>HU1</w:t>
             </w:r>
           </w:p>
         </w:tc>
@@ -3541,7 +4430,7 @@
                 <w:rFonts w:asciiTheme="minorHAnsi" w:hAnsiTheme="minorHAnsi" w:cstheme="minorHAnsi"/>
                 <w:szCs w:val="24"/>
               </w:rPr>
-              <w:t>LEC-10</w:t>
+              <w:t>HU2</w:t>
             </w:r>
           </w:p>
         </w:tc>
@@ -3663,7 +4552,7 @@
                 <w:rFonts w:asciiTheme="minorHAnsi" w:hAnsiTheme="minorHAnsi" w:cstheme="minorHAnsi"/>
                 <w:szCs w:val="24"/>
               </w:rPr>
-              <w:t>LEC-11</w:t>
+              <w:t>HU3</w:t>
             </w:r>
           </w:p>
         </w:tc>
@@ -3768,7 +4657,7 @@
                 <w:rFonts w:asciiTheme="minorHAnsi" w:hAnsiTheme="minorHAnsi" w:cstheme="minorHAnsi"/>
                 <w:szCs w:val="24"/>
               </w:rPr>
-              <w:t>LEC-12</w:t>
+              <w:t>HU4</w:t>
             </w:r>
           </w:p>
         </w:tc>
@@ -3873,7 +4762,7 @@
                 <w:rFonts w:asciiTheme="minorHAnsi" w:hAnsiTheme="minorHAnsi" w:cstheme="minorHAnsi"/>
                 <w:szCs w:val="24"/>
               </w:rPr>
-              <w:t>LEC-13</w:t>
+              <w:t>HU5</w:t>
             </w:r>
           </w:p>
         </w:tc>
@@ -3978,7 +4867,7 @@
                 <w:rFonts w:asciiTheme="minorHAnsi" w:hAnsiTheme="minorHAnsi" w:cstheme="minorHAnsi"/>
                 <w:szCs w:val="24"/>
               </w:rPr>
-              <w:t>LEC-14</w:t>
+              <w:t>HU6</w:t>
             </w:r>
           </w:p>
         </w:tc>
@@ -4086,7 +4975,7 @@
                 <w:rFonts w:asciiTheme="minorHAnsi" w:hAnsiTheme="minorHAnsi" w:cstheme="minorHAnsi"/>
                 <w:szCs w:val="24"/>
               </w:rPr>
-              <w:t>LEC-15</w:t>
+              <w:t>HU7</w:t>
             </w:r>
           </w:p>
         </w:tc>
@@ -4191,7 +5080,7 @@
                 <w:rFonts w:asciiTheme="minorHAnsi" w:hAnsiTheme="minorHAnsi" w:cstheme="minorHAnsi"/>
                 <w:szCs w:val="24"/>
               </w:rPr>
-              <w:t>LEC-16</w:t>
+              <w:t>HU8</w:t>
             </w:r>
           </w:p>
         </w:tc>
@@ -4296,7 +5185,7 @@
                 <w:rFonts w:asciiTheme="minorHAnsi" w:hAnsiTheme="minorHAnsi" w:cstheme="minorHAnsi"/>
                 <w:szCs w:val="24"/>
               </w:rPr>
-              <w:t>LEC-17</w:t>
+              <w:t>HU9</w:t>
             </w:r>
           </w:p>
         </w:tc>
@@ -4384,7 +5273,7 @@
                 <w:szCs w:val="24"/>
               </w:rPr>
               <w:lastRenderedPageBreak/>
-              <w:t>LEC-18</w:t>
+              <w:t>HU10</w:t>
             </w:r>
           </w:p>
         </w:tc>
@@ -4490,7 +5379,7 @@
                 <w:rFonts w:asciiTheme="minorHAnsi" w:hAnsiTheme="minorHAnsi" w:cstheme="minorHAnsi"/>
                 <w:szCs w:val="24"/>
               </w:rPr>
-              <w:t>LEC-19</w:t>
+              <w:t>HU11</w:t>
             </w:r>
           </w:p>
         </w:tc>
@@ -4628,7 +5517,7 @@
                 <w:rFonts w:asciiTheme="minorHAnsi" w:hAnsiTheme="minorHAnsi" w:cstheme="minorHAnsi"/>
                 <w:szCs w:val="24"/>
               </w:rPr>
-              <w:t>LEC-20</w:t>
+              <w:t>HU12</w:t>
             </w:r>
           </w:p>
         </w:tc>
@@ -4734,7 +5623,7 @@
                 <w:rFonts w:asciiTheme="minorHAnsi" w:hAnsiTheme="minorHAnsi" w:cstheme="minorHAnsi"/>
                 <w:szCs w:val="24"/>
               </w:rPr>
-              <w:t>LEC-21</w:t>
+              <w:t>HU13</w:t>
             </w:r>
           </w:p>
         </w:tc>
@@ -4840,7 +5729,7 @@
                 <w:rFonts w:asciiTheme="minorHAnsi" w:hAnsiTheme="minorHAnsi" w:cstheme="minorHAnsi"/>
                 <w:szCs w:val="24"/>
               </w:rPr>
-              <w:t>LEC-22</w:t>
+              <w:t>HU14</w:t>
             </w:r>
           </w:p>
         </w:tc>
@@ -4946,7 +5835,7 @@
                 <w:rFonts w:asciiTheme="minorHAnsi" w:hAnsiTheme="minorHAnsi" w:cstheme="minorHAnsi"/>
                 <w:szCs w:val="24"/>
               </w:rPr>
-              <w:t>LEC-23</w:t>
+              <w:t>HU15</w:t>
             </w:r>
           </w:p>
         </w:tc>
@@ -5061,7 +5950,7 @@
                 <w:rFonts w:asciiTheme="minorHAnsi" w:hAnsiTheme="minorHAnsi" w:cstheme="minorHAnsi"/>
                 <w:szCs w:val="24"/>
               </w:rPr>
-              <w:t>LEC-24</w:t>
+              <w:t>HU16</w:t>
             </w:r>
           </w:p>
         </w:tc>
@@ -5168,7 +6057,7 @@
                 <w:rFonts w:asciiTheme="minorHAnsi" w:hAnsiTheme="minorHAnsi" w:cstheme="minorHAnsi"/>
                 <w:szCs w:val="24"/>
               </w:rPr>
-              <w:t>LEC-25</w:t>
+              <w:t>HU17</w:t>
             </w:r>
           </w:p>
         </w:tc>
@@ -5254,7 +6143,7 @@
           </w:p>
         </w:tc>
       </w:tr>
-      <w:bookmarkEnd w:id="13"/>
+      <w:bookmarkEnd w:id="24"/>
       <w:tr>
         <w:tc>
           <w:tcPr>
@@ -5275,7 +6164,7 @@
                 <w:rFonts w:asciiTheme="minorHAnsi" w:hAnsiTheme="minorHAnsi" w:cstheme="minorHAnsi"/>
                 <w:szCs w:val="24"/>
               </w:rPr>
-              <w:t>LEC-26</w:t>
+              <w:t>HU18</w:t>
             </w:r>
           </w:p>
         </w:tc>
@@ -5381,7 +6270,7 @@
                 <w:rFonts w:asciiTheme="minorHAnsi" w:hAnsiTheme="minorHAnsi" w:cstheme="minorHAnsi"/>
                 <w:szCs w:val="24"/>
               </w:rPr>
-              <w:t>LEC-27</w:t>
+              <w:t>HU19</w:t>
             </w:r>
           </w:p>
         </w:tc>
@@ -5487,7 +6376,7 @@
                 <w:rFonts w:asciiTheme="minorHAnsi" w:hAnsiTheme="minorHAnsi" w:cstheme="minorHAnsi"/>
                 <w:szCs w:val="24"/>
               </w:rPr>
-              <w:t>LEC-28</w:t>
+              <w:t>HU20</w:t>
             </w:r>
           </w:p>
         </w:tc>
@@ -5593,7 +6482,14 @@
                 <w:rFonts w:asciiTheme="minorHAnsi" w:hAnsiTheme="minorHAnsi" w:cstheme="minorHAnsi"/>
                 <w:szCs w:val="24"/>
               </w:rPr>
-              <w:t>LEC-29</w:t>
+              <w:t>HU2</w:t>
+            </w:r>
+            <w:r>
+              <w:rPr>
+                <w:rFonts w:asciiTheme="minorHAnsi" w:hAnsiTheme="minorHAnsi" w:cstheme="minorHAnsi"/>
+                <w:szCs w:val="24"/>
+              </w:rPr>
+              <w:t>1</w:t>
             </w:r>
           </w:p>
         </w:tc>
@@ -5699,7 +6595,7 @@
                 <w:rFonts w:asciiTheme="minorHAnsi" w:hAnsiTheme="minorHAnsi" w:cstheme="minorHAnsi"/>
                 <w:szCs w:val="24"/>
               </w:rPr>
-              <w:t>LEC-30</w:t>
+              <w:t>HU22</w:t>
             </w:r>
           </w:p>
         </w:tc>
@@ -5805,7 +6701,7 @@
                 <w:rFonts w:asciiTheme="minorHAnsi" w:hAnsiTheme="minorHAnsi" w:cstheme="minorHAnsi"/>
                 <w:szCs w:val="24"/>
               </w:rPr>
-              <w:t>LEC-31</w:t>
+              <w:t>HU23</w:t>
             </w:r>
           </w:p>
         </w:tc>
@@ -5912,7 +6808,7 @@
                 <w:szCs w:val="24"/>
               </w:rPr>
               <w:lastRenderedPageBreak/>
-              <w:t>LEC-113</w:t>
+              <w:t>HU24</w:t>
             </w:r>
           </w:p>
         </w:tc>
@@ -6018,7 +6914,7 @@
                 <w:rFonts w:asciiTheme="minorHAnsi" w:hAnsiTheme="minorHAnsi" w:cstheme="minorHAnsi"/>
                 <w:szCs w:val="24"/>
               </w:rPr>
-              <w:t>LEC-32</w:t>
+              <w:t>HU25</w:t>
             </w:r>
           </w:p>
         </w:tc>
@@ -6140,7 +7036,7 @@
                 <w:rFonts w:asciiTheme="minorHAnsi" w:hAnsiTheme="minorHAnsi" w:cstheme="minorHAnsi"/>
                 <w:szCs w:val="24"/>
               </w:rPr>
-              <w:t>LEC-55</w:t>
+              <w:t>HU26</w:t>
             </w:r>
           </w:p>
         </w:tc>
@@ -6246,7 +7142,7 @@
                 <w:rFonts w:asciiTheme="minorHAnsi" w:hAnsiTheme="minorHAnsi" w:cstheme="minorHAnsi"/>
                 <w:szCs w:val="24"/>
               </w:rPr>
-              <w:t>LEC-33</w:t>
+              <w:t>HU27</w:t>
             </w:r>
           </w:p>
         </w:tc>
@@ -6352,7 +7248,7 @@
                 <w:rFonts w:asciiTheme="minorHAnsi" w:hAnsiTheme="minorHAnsi" w:cstheme="minorHAnsi"/>
                 <w:szCs w:val="24"/>
               </w:rPr>
-              <w:t>LEC-34</w:t>
+              <w:t>HU28</w:t>
             </w:r>
           </w:p>
         </w:tc>
@@ -6458,7 +7354,7 @@
                 <w:rFonts w:asciiTheme="minorHAnsi" w:hAnsiTheme="minorHAnsi" w:cstheme="minorHAnsi"/>
                 <w:szCs w:val="24"/>
               </w:rPr>
-              <w:t>LEC-35</w:t>
+              <w:t>HU29</w:t>
             </w:r>
           </w:p>
         </w:tc>
@@ -6564,7 +7460,7 @@
                 <w:rFonts w:asciiTheme="minorHAnsi" w:hAnsiTheme="minorHAnsi" w:cstheme="minorHAnsi"/>
                 <w:szCs w:val="24"/>
               </w:rPr>
-              <w:t>LEC-36</w:t>
+              <w:t>HU30</w:t>
             </w:r>
           </w:p>
         </w:tc>
@@ -6670,7 +7566,7 @@
                 <w:rFonts w:asciiTheme="minorHAnsi" w:hAnsiTheme="minorHAnsi" w:cstheme="minorHAnsi"/>
                 <w:szCs w:val="24"/>
               </w:rPr>
-              <w:t>LEC-37</w:t>
+              <w:t>HU31</w:t>
             </w:r>
           </w:p>
         </w:tc>
@@ -6776,7 +7672,7 @@
                 <w:rFonts w:asciiTheme="minorHAnsi" w:hAnsiTheme="minorHAnsi" w:cstheme="minorHAnsi"/>
                 <w:szCs w:val="24"/>
               </w:rPr>
-              <w:t>LEC-38</w:t>
+              <w:t>HU32</w:t>
             </w:r>
           </w:p>
         </w:tc>
@@ -6882,7 +7778,7 @@
                 <w:rFonts w:asciiTheme="minorHAnsi" w:hAnsiTheme="minorHAnsi" w:cstheme="minorHAnsi"/>
                 <w:szCs w:val="24"/>
               </w:rPr>
-              <w:t>LEC-39</w:t>
+              <w:t>HU33</w:t>
             </w:r>
           </w:p>
         </w:tc>
@@ -6988,7 +7884,7 @@
                 <w:rFonts w:asciiTheme="minorHAnsi" w:hAnsiTheme="minorHAnsi" w:cstheme="minorHAnsi"/>
                 <w:szCs w:val="24"/>
               </w:rPr>
-              <w:t>LEC-40</w:t>
+              <w:t>HU34</w:t>
             </w:r>
           </w:p>
         </w:tc>
@@ -7094,7 +7990,7 @@
                 <w:rFonts w:asciiTheme="minorHAnsi" w:hAnsiTheme="minorHAnsi" w:cstheme="minorHAnsi"/>
                 <w:szCs w:val="24"/>
               </w:rPr>
-              <w:t>LEC-41</w:t>
+              <w:t>HU35</w:t>
             </w:r>
           </w:p>
         </w:tc>
@@ -7200,7 +8096,7 @@
                 <w:rFonts w:asciiTheme="minorHAnsi" w:hAnsiTheme="minorHAnsi" w:cstheme="minorHAnsi"/>
                 <w:szCs w:val="24"/>
               </w:rPr>
-              <w:t>LEC-42</w:t>
+              <w:t>HU36</w:t>
             </w:r>
           </w:p>
         </w:tc>
@@ -7307,7 +8203,7 @@
                 <w:szCs w:val="24"/>
               </w:rPr>
               <w:lastRenderedPageBreak/>
-              <w:t>LEC-43</w:t>
+              <w:t>HU37</w:t>
             </w:r>
           </w:p>
         </w:tc>
@@ -7413,7 +8309,7 @@
                 <w:rFonts w:asciiTheme="minorHAnsi" w:hAnsiTheme="minorHAnsi" w:cstheme="minorHAnsi"/>
                 <w:szCs w:val="24"/>
               </w:rPr>
-              <w:t>LEC-44</w:t>
+              <w:t>HU38</w:t>
             </w:r>
           </w:p>
         </w:tc>
@@ -7519,7 +8415,7 @@
                 <w:rFonts w:asciiTheme="minorHAnsi" w:hAnsiTheme="minorHAnsi" w:cstheme="minorHAnsi"/>
                 <w:szCs w:val="24"/>
               </w:rPr>
-              <w:t>LEC-56</w:t>
+              <w:t>HU39</w:t>
             </w:r>
           </w:p>
         </w:tc>
@@ -7625,7 +8521,7 @@
                 <w:rFonts w:asciiTheme="minorHAnsi" w:hAnsiTheme="minorHAnsi" w:cstheme="minorHAnsi"/>
                 <w:szCs w:val="24"/>
               </w:rPr>
-              <w:t>LEC-57</w:t>
+              <w:t>HU40</w:t>
             </w:r>
           </w:p>
         </w:tc>
@@ -7731,7 +8627,7 @@
                 <w:rFonts w:asciiTheme="minorHAnsi" w:hAnsiTheme="minorHAnsi" w:cstheme="minorHAnsi"/>
                 <w:szCs w:val="24"/>
               </w:rPr>
-              <w:t>LEC-45</w:t>
+              <w:t>HU41</w:t>
             </w:r>
           </w:p>
         </w:tc>
@@ -7837,7 +8733,7 @@
                 <w:rFonts w:asciiTheme="minorHAnsi" w:hAnsiTheme="minorHAnsi" w:cstheme="minorHAnsi"/>
                 <w:szCs w:val="24"/>
               </w:rPr>
-              <w:t>LEC-46</w:t>
+              <w:t>HU42</w:t>
             </w:r>
           </w:p>
         </w:tc>
@@ -7943,7 +8839,7 @@
                 <w:rFonts w:asciiTheme="minorHAnsi" w:hAnsiTheme="minorHAnsi" w:cstheme="minorHAnsi"/>
                 <w:szCs w:val="24"/>
               </w:rPr>
-              <w:t>LEC-47</w:t>
+              <w:t>HU43</w:t>
             </w:r>
           </w:p>
         </w:tc>
@@ -8049,7 +8945,7 @@
                 <w:rFonts w:asciiTheme="minorHAnsi" w:hAnsiTheme="minorHAnsi" w:cstheme="minorHAnsi"/>
                 <w:szCs w:val="24"/>
               </w:rPr>
-              <w:t>LEC-48</w:t>
+              <w:t>HU44</w:t>
             </w:r>
           </w:p>
         </w:tc>
@@ -8155,7 +9051,7 @@
                 <w:rFonts w:asciiTheme="minorHAnsi" w:hAnsiTheme="minorHAnsi" w:cstheme="minorHAnsi"/>
                 <w:szCs w:val="24"/>
               </w:rPr>
-              <w:t>LEC-58</w:t>
+              <w:t>HU45</w:t>
             </w:r>
           </w:p>
         </w:tc>
@@ -8261,7 +9157,7 @@
                 <w:rFonts w:asciiTheme="minorHAnsi" w:hAnsiTheme="minorHAnsi" w:cstheme="minorHAnsi"/>
                 <w:szCs w:val="24"/>
               </w:rPr>
-              <w:t>LEC-59</w:t>
+              <w:t>HU46</w:t>
             </w:r>
           </w:p>
         </w:tc>
@@ -8374,7 +9270,7 @@
                 <w:rFonts w:asciiTheme="minorHAnsi" w:hAnsiTheme="minorHAnsi" w:cstheme="minorHAnsi"/>
                 <w:szCs w:val="24"/>
               </w:rPr>
-              <w:t>LEC-60</w:t>
+              <w:t>HU47</w:t>
             </w:r>
           </w:p>
         </w:tc>
@@ -8480,7 +9376,7 @@
                 <w:rFonts w:asciiTheme="minorHAnsi" w:hAnsiTheme="minorHAnsi" w:cstheme="minorHAnsi"/>
                 <w:szCs w:val="24"/>
               </w:rPr>
-              <w:t>LEC-49</w:t>
+              <w:t>HU48</w:t>
             </w:r>
           </w:p>
         </w:tc>
@@ -8586,7 +9482,7 @@
                 <w:rFonts w:asciiTheme="minorHAnsi" w:hAnsiTheme="minorHAnsi" w:cstheme="minorHAnsi"/>
                 <w:szCs w:val="24"/>
               </w:rPr>
-              <w:t>LEC-50</w:t>
+              <w:t>HU49</w:t>
             </w:r>
           </w:p>
         </w:tc>
@@ -8692,7 +9588,14 @@
                 <w:rFonts w:asciiTheme="minorHAnsi" w:hAnsiTheme="minorHAnsi" w:cstheme="minorHAnsi"/>
                 <w:szCs w:val="24"/>
               </w:rPr>
-              <w:t>LEC-51</w:t>
+              <w:t>HU5</w:t>
+            </w:r>
+            <w:r>
+              <w:rPr>
+                <w:rFonts w:asciiTheme="minorHAnsi" w:hAnsiTheme="minorHAnsi" w:cstheme="minorHAnsi"/>
+                <w:szCs w:val="24"/>
+              </w:rPr>
+              <w:t>0</w:t>
             </w:r>
           </w:p>
         </w:tc>
@@ -8810,7 +9713,7 @@
                 <w:szCs w:val="24"/>
               </w:rPr>
               <w:lastRenderedPageBreak/>
-              <w:t>LEC-52</w:t>
+              <w:t>HU51</w:t>
             </w:r>
           </w:p>
         </w:tc>
@@ -8916,7 +9819,7 @@
                 <w:rFonts w:asciiTheme="minorHAnsi" w:hAnsiTheme="minorHAnsi" w:cstheme="minorHAnsi"/>
                 <w:szCs w:val="24"/>
               </w:rPr>
-              <w:t>LEC-61</w:t>
+              <w:t>HU52</w:t>
             </w:r>
           </w:p>
         </w:tc>
@@ -9022,7 +9925,7 @@
                 <w:rFonts w:asciiTheme="minorHAnsi" w:hAnsiTheme="minorHAnsi" w:cstheme="minorHAnsi"/>
                 <w:szCs w:val="24"/>
               </w:rPr>
-              <w:t>LEC-62</w:t>
+              <w:t>HU53</w:t>
             </w:r>
           </w:p>
         </w:tc>
@@ -9128,7 +10031,7 @@
                 <w:rFonts w:asciiTheme="minorHAnsi" w:hAnsiTheme="minorHAnsi" w:cstheme="minorHAnsi"/>
                 <w:szCs w:val="24"/>
               </w:rPr>
-              <w:t>LEC-53</w:t>
+              <w:t>HU54</w:t>
             </w:r>
           </w:p>
         </w:tc>
@@ -9234,7 +10137,7 @@
                 <w:rFonts w:asciiTheme="minorHAnsi" w:hAnsiTheme="minorHAnsi" w:cstheme="minorHAnsi"/>
                 <w:szCs w:val="24"/>
               </w:rPr>
-              <w:t>LEC-54</w:t>
+              <w:t>HU55</w:t>
             </w:r>
           </w:p>
         </w:tc>
@@ -9323,21 +10226,85 @@
     </w:tbl>
     <w:p>
       <w:pPr>
-        <w:jc w:val="both"/>
-        <w:rPr>
-          <w:lang w:eastAsia="es-ES" w:bidi="ar-SA"/>
-        </w:rPr>
-      </w:pPr>
+        <w:pStyle w:val="Descripcin"/>
+        <w:jc w:val="end"/>
+      </w:pPr>
+      <w:bookmarkStart w:id="25" w:name="_Toc215211644"/>
+      <w:bookmarkStart w:id="26" w:name="_Toc215559173"/>
+      <w:bookmarkStart w:id="27" w:name="_Toc215559701"/>
+      <w:bookmarkStart w:id="28" w:name="_Toc215560159"/>
+      <w:r>
+        <w:rPr>
+          <w:b/>
+          <w:bCs/>
+        </w:rPr>
+        <w:t xml:space="preserve">Tabla </w:t>
+      </w:r>
+      <w:r>
+        <w:rPr>
+          <w:b/>
+          <w:bCs/>
+        </w:rPr>
+        <w:fldChar w:fldCharType="begin"/>
+      </w:r>
+      <w:r>
+        <w:rPr>
+          <w:b/>
+          <w:bCs/>
+        </w:rPr>
+        <w:instrText xml:space="preserve"> SEQ Tabla \* ARABIC </w:instrText>
+      </w:r>
+      <w:r>
+        <w:rPr>
+          <w:b/>
+          <w:bCs/>
+        </w:rPr>
+        <w:fldChar w:fldCharType="separate"/>
+      </w:r>
+      <w:r>
+        <w:rPr>
+          <w:b/>
+          <w:bCs/>
+          <w:noProof/>
+        </w:rPr>
+        <w:t>1</w:t>
+      </w:r>
+      <w:r>
+        <w:rPr>
+          <w:b/>
+          <w:bCs/>
+        </w:rPr>
+        <w:fldChar w:fldCharType="end"/>
+      </w:r>
+      <w:r>
+        <w:rPr>
+          <w:b/>
+          <w:bCs/>
+        </w:rPr>
+        <w:t>.</w:t>
+      </w:r>
+      <w:r>
+        <w:t xml:space="preserve"> </w:t>
+      </w:r>
+      <w:r>
+        <w:rPr>
+          <w:rStyle w:val="Referenciasutil"/>
+          <w:szCs w:val="18"/>
+        </w:rPr>
+        <w:t>Historias de usuario</w:t>
+      </w:r>
+      <w:bookmarkEnd w:id="27"/>
+      <w:bookmarkEnd w:id="28"/>
     </w:p>
     <w:p>
       <w:pPr>
         <w:pStyle w:val="Ttulo2"/>
       </w:pPr>
-      <w:bookmarkStart w:id="14" w:name="_Toc215211644"/>
       <w:r>
         <w:t>Definición de tareas</w:t>
       </w:r>
-      <w:bookmarkEnd w:id="14"/>
+      <w:bookmarkEnd w:id="25"/>
+      <w:bookmarkEnd w:id="26"/>
     </w:p>
     <w:p>
       <w:pPr>
@@ -9380,13 +10347,21 @@
     <w:p>
       <w:pPr>
         <w:pStyle w:val="NormalWeb"/>
-        <w:jc w:val="center"/>
+        <w:jc w:val="both"/>
         <w:rPr>
           <w:rFonts w:ascii="Arial" w:eastAsia="Times New Roman" w:hAnsi="Arial" w:cs="Arial"/>
           <w:kern w:val="0"/>
           <w:lang w:eastAsia="es-ES" w:bidi="ar-SA"/>
         </w:rPr>
       </w:pPr>
+      <w:r>
+        <w:rPr>
+          <w:rFonts w:ascii="Arial" w:eastAsia="Times New Roman" w:hAnsi="Arial" w:cs="Arial"/>
+          <w:kern w:val="0"/>
+          <w:lang w:eastAsia="es-ES" w:bidi="ar-SA"/>
+        </w:rPr>
+        <w:tab/>
+      </w:r>
     </w:p>
     <w:tbl>
       <w:tblPr>
@@ -10608,8 +11583,17 @@
                 <w:rFonts w:asciiTheme="minorHAnsi" w:hAnsiTheme="minorHAnsi" w:cstheme="minorHAnsi"/>
                 <w:szCs w:val="24"/>
               </w:rPr>
-              <w:t>Integrar selección de dirección en checkout</w:t>
-            </w:r>
+              <w:t xml:space="preserve">Integrar selección de dirección en </w:t>
+            </w:r>
+            <w:proofErr w:type="spellStart"/>
+            <w:r>
+              <w:rPr>
+                <w:rFonts w:asciiTheme="minorHAnsi" w:hAnsiTheme="minorHAnsi" w:cstheme="minorHAnsi"/>
+                <w:szCs w:val="24"/>
+              </w:rPr>
+              <w:t>checkout</w:t>
+            </w:r>
+            <w:proofErr w:type="spellEnd"/>
           </w:p>
         </w:tc>
         <w:tc>
@@ -10782,12 +11766,21 @@
                 <w:szCs w:val="24"/>
               </w:rPr>
             </w:pPr>
-            <w:r>
-              <w:rPr>
-                <w:rFonts w:asciiTheme="minorHAnsi" w:hAnsiTheme="minorHAnsi" w:cstheme="minorHAnsi"/>
-                <w:szCs w:val="24"/>
-              </w:rPr>
-              <w:t>Implemetar descarga de e-books y audiolibros</w:t>
+            <w:proofErr w:type="spellStart"/>
+            <w:r>
+              <w:rPr>
+                <w:rFonts w:asciiTheme="minorHAnsi" w:hAnsiTheme="minorHAnsi" w:cstheme="minorHAnsi"/>
+                <w:szCs w:val="24"/>
+              </w:rPr>
+              <w:t>Implemetar</w:t>
+            </w:r>
+            <w:proofErr w:type="spellEnd"/>
+            <w:r>
+              <w:rPr>
+                <w:rFonts w:asciiTheme="minorHAnsi" w:hAnsiTheme="minorHAnsi" w:cstheme="minorHAnsi"/>
+                <w:szCs w:val="24"/>
+              </w:rPr>
+              <w:t xml:space="preserve"> descarga de e-books y audiolibros</w:t>
             </w:r>
           </w:p>
           <w:p>
@@ -11541,6 +12534,7 @@
           <w:p>
             <w:pPr>
               <w:pStyle w:val="NormalWeb"/>
+              <w:keepNext/>
               <w:jc w:val="center"/>
               <w:rPr>
                 <w:rFonts w:asciiTheme="minorHAnsi" w:hAnsiTheme="minorHAnsi" w:cstheme="minorHAnsi"/>
@@ -11560,6 +12554,67 @@
     </w:tbl>
     <w:p>
       <w:pPr>
+        <w:pStyle w:val="Descripcin"/>
+        <w:jc w:val="end"/>
+      </w:pPr>
+      <w:bookmarkStart w:id="29" w:name="_Toc215560160"/>
+      <w:r>
+        <w:rPr>
+          <w:b/>
+          <w:bCs/>
+        </w:rPr>
+        <w:t xml:space="preserve">Tabla </w:t>
+      </w:r>
+      <w:r>
+        <w:rPr>
+          <w:b/>
+          <w:bCs/>
+        </w:rPr>
+        <w:fldChar w:fldCharType="begin"/>
+      </w:r>
+      <w:r>
+        <w:rPr>
+          <w:b/>
+          <w:bCs/>
+        </w:rPr>
+        <w:instrText xml:space="preserve"> SEQ Tabla \* ARABIC </w:instrText>
+      </w:r>
+      <w:r>
+        <w:rPr>
+          <w:b/>
+          <w:bCs/>
+        </w:rPr>
+        <w:fldChar w:fldCharType="separate"/>
+      </w:r>
+      <w:r>
+        <w:rPr>
+          <w:b/>
+          <w:bCs/>
+          <w:noProof/>
+        </w:rPr>
+        <w:t>2</w:t>
+      </w:r>
+      <w:r>
+        <w:rPr>
+          <w:b/>
+          <w:bCs/>
+        </w:rPr>
+        <w:fldChar w:fldCharType="end"/>
+      </w:r>
+      <w:r>
+        <w:rPr>
+          <w:b/>
+          <w:bCs/>
+        </w:rPr>
+        <w:t>.</w:t>
+      </w:r>
+      <w:r>
+        <w:t xml:space="preserve"> Desglose de Tareas y Subtareas</w:t>
+      </w:r>
+      <w:bookmarkEnd w:id="29"/>
+    </w:p>
+    <w:p>
+      <w:pPr>
         <w:pStyle w:val="NormalWeb"/>
         <w:jc w:val="both"/>
         <w:rPr>
@@ -11571,33 +12626,16 @@
     </w:p>
     <w:p>
       <w:pPr>
-        <w:pStyle w:val="NormalWeb"/>
+        <w:ind w:start="42.50pt"/>
         <w:jc w:val="both"/>
         <w:rPr>
           <w:rFonts w:ascii="Arial" w:eastAsia="Times New Roman" w:hAnsi="Arial" w:cs="Arial"/>
           <w:kern w:val="0"/>
+          <w:sz w:val="18"/>
+          <w:szCs w:val="18"/>
           <w:lang w:eastAsia="es-ES" w:bidi="ar-SA"/>
         </w:rPr>
       </w:pPr>
-    </w:p>
-    <w:p>
-      <w:pPr>
-        <w:ind w:start="42.50pt"/>
-        <w:jc w:val="both"/>
-        <w:rPr>
-          <w:rFonts w:ascii="Arial" w:eastAsia="Times New Roman" w:hAnsi="Arial" w:cs="Arial"/>
-          <w:kern w:val="0"/>
-          <w:lang w:eastAsia="es-ES" w:bidi="ar-SA"/>
-        </w:rPr>
-      </w:pPr>
-      <w:r>
-        <w:rPr>
-          <w:rFonts w:ascii="Arial" w:eastAsia="Times New Roman" w:hAnsi="Arial" w:cs="Arial"/>
-          <w:kern w:val="0"/>
-          <w:lang w:eastAsia="es-ES" w:bidi="ar-SA"/>
-        </w:rPr>
-        <w:t>Tabla Resumen de Tareas Generales</w:t>
-      </w:r>
     </w:p>
     <w:tbl>
       <w:tblPr>
@@ -12427,6 +13465,7 @@
                 <w:rFonts w:asciiTheme="minorHAnsi" w:hAnsiTheme="minorHAnsi" w:cstheme="minorHAnsi"/>
                 <w:szCs w:val="24"/>
               </w:rPr>
+              <w:lastRenderedPageBreak/>
               <w:t>T5.1. Diseño interfaz e-commerce</w:t>
             </w:r>
           </w:p>
@@ -12498,7 +13537,6 @@
                 <w:rFonts w:asciiTheme="minorHAnsi" w:hAnsiTheme="minorHAnsi" w:cstheme="minorHAnsi"/>
                 <w:szCs w:val="24"/>
               </w:rPr>
-              <w:lastRenderedPageBreak/>
               <w:t>T6 Segundo sprint (Compras y biblioteca)</w:t>
             </w:r>
           </w:p>
@@ -13099,6 +14137,7 @@
           <w:p>
             <w:pPr>
               <w:pStyle w:val="NormalWeb"/>
+              <w:keepNext/>
               <w:jc w:val="center"/>
               <w:rPr>
                 <w:rFonts w:asciiTheme="minorHAnsi" w:hAnsiTheme="minorHAnsi" w:cstheme="minorHAnsi"/>
@@ -13118,23 +14157,76 @@
     </w:tbl>
     <w:p>
       <w:pPr>
-        <w:jc w:val="both"/>
-        <w:rPr>
-          <w:rFonts w:ascii="Arial" w:eastAsia="Times New Roman" w:hAnsi="Arial" w:cs="Arial"/>
-          <w:kern w:val="0"/>
-          <w:lang w:eastAsia="es-ES" w:bidi="ar-SA"/>
-        </w:rPr>
-      </w:pPr>
+        <w:pStyle w:val="Descripcin"/>
+        <w:jc w:val="end"/>
+      </w:pPr>
+      <w:bookmarkStart w:id="30" w:name="_Toc215560161"/>
+      <w:r>
+        <w:rPr>
+          <w:b/>
+          <w:bCs/>
+        </w:rPr>
+        <w:t xml:space="preserve">Tabla </w:t>
+      </w:r>
+      <w:r>
+        <w:rPr>
+          <w:b/>
+          <w:bCs/>
+        </w:rPr>
+        <w:fldChar w:fldCharType="begin"/>
+      </w:r>
+      <w:r>
+        <w:rPr>
+          <w:b/>
+          <w:bCs/>
+        </w:rPr>
+        <w:instrText xml:space="preserve"> SEQ Tabla \* ARABIC </w:instrText>
+      </w:r>
+      <w:r>
+        <w:rPr>
+          <w:b/>
+          <w:bCs/>
+        </w:rPr>
+        <w:fldChar w:fldCharType="separate"/>
+      </w:r>
+      <w:r>
+        <w:rPr>
+          <w:b/>
+          <w:bCs/>
+          <w:noProof/>
+        </w:rPr>
+        <w:t>3</w:t>
+      </w:r>
+      <w:r>
+        <w:rPr>
+          <w:b/>
+          <w:bCs/>
+        </w:rPr>
+        <w:fldChar w:fldCharType="end"/>
+      </w:r>
+      <w:r>
+        <w:rPr>
+          <w:b/>
+          <w:bCs/>
+        </w:rPr>
+        <w:t>.</w:t>
+      </w:r>
+      <w:r>
+        <w:t xml:space="preserve"> Resumen de Tareas Generales</w:t>
+      </w:r>
+      <w:bookmarkEnd w:id="30"/>
     </w:p>
     <w:p>
       <w:pPr>
         <w:pStyle w:val="Ttulo2"/>
       </w:pPr>
-      <w:bookmarkStart w:id="15" w:name="_Toc215211645"/>
+      <w:bookmarkStart w:id="31" w:name="_Toc215211645"/>
+      <w:bookmarkStart w:id="32" w:name="_Toc215559174"/>
       <w:r>
         <w:t>Metodología a seguir para la realización del proyecto</w:t>
       </w:r>
-      <w:bookmarkEnd w:id="15"/>
+      <w:bookmarkEnd w:id="31"/>
+      <w:bookmarkEnd w:id="32"/>
     </w:p>
     <w:p>
       <w:pPr>
@@ -13315,31 +14407,167 @@
     </w:p>
     <w:p>
       <w:pPr>
-        <w:pStyle w:val="Ttulo2"/>
-      </w:pPr>
-      <w:bookmarkStart w:id="16" w:name="_Toc215211646"/>
-      <w:r>
-        <w:t>Planificación temporal de tareas</w:t>
-      </w:r>
-      <w:bookmarkEnd w:id="16"/>
-    </w:p>
-    <w:p>
-      <w:pPr>
-        <w:ind w:start="42.50pt" w:end="35.45pt"/>
-        <w:jc w:val="both"/>
+        <w:keepNext/>
+        <w:ind w:end="35.45pt"/>
+        <w:jc w:val="center"/>
+      </w:pPr>
+      <w:r>
         <w:rPr>
           <w:rFonts w:ascii="Arial" w:eastAsia="Times New Roman" w:hAnsi="Arial" w:cs="Arial"/>
           <w:kern w:val="0"/>
           <w:lang w:eastAsia="es-ES" w:bidi="ar-SA"/>
         </w:rPr>
-      </w:pPr>
-      <w:r>
+        <w:drawing>
+          <wp:inline distT="0" distB="0" distL="0" distR="0" wp14:anchorId="281E0AF6" wp14:editId="6F20C793">
+            <wp:extent cx="5661718" cy="2546350"/>
+            <wp:effectExtent l="0" t="0" r="0" b="6350"/>
+            <wp:docPr id="1965706640" name="Imagen 1"/>
+            <wp:cNvGraphicFramePr>
+              <a:graphicFrameLocks xmlns:a="http://purl.oclc.org/ooxml/drawingml/main" noChangeAspect="1"/>
+            </wp:cNvGraphicFramePr>
+            <a:graphic xmlns:a="http://purl.oclc.org/ooxml/drawingml/main">
+              <a:graphicData uri="http://purl.oclc.org/ooxml/drawingml/picture">
+                <pic:pic xmlns:pic="http://purl.oclc.org/ooxml/drawingml/picture">
+                  <pic:nvPicPr>
+                    <pic:cNvPr id="1965706640" name=""/>
+                    <pic:cNvPicPr/>
+                  </pic:nvPicPr>
+                  <pic:blipFill>
+                    <a:blip r:embed="rId12"/>
+                    <a:stretch>
+                      <a:fillRect/>
+                    </a:stretch>
+                  </pic:blipFill>
+                  <pic:spPr>
+                    <a:xfrm>
+                      <a:off x="0" y="0"/>
+                      <a:ext cx="5666982" cy="2548718"/>
+                    </a:xfrm>
+                    <a:prstGeom prst="rect">
+                      <a:avLst/>
+                    </a:prstGeom>
+                  </pic:spPr>
+                </pic:pic>
+              </a:graphicData>
+            </a:graphic>
+          </wp:inline>
+        </w:drawing>
+      </w:r>
+    </w:p>
+    <w:p>
+      <w:pPr>
+        <w:pStyle w:val="Descripcin"/>
+        <w:jc w:val="end"/>
         <w:rPr>
           <w:rFonts w:ascii="Arial" w:eastAsia="Times New Roman" w:hAnsi="Arial" w:cs="Arial"/>
           <w:kern w:val="0"/>
           <w:lang w:eastAsia="es-ES" w:bidi="ar-SA"/>
         </w:rPr>
-        <w:t>La planificación temporal sigue un enfoque iterativo. A continuación se detalla el cronograma por fases:</w:t>
+      </w:pPr>
+      <w:bookmarkStart w:id="33" w:name="_Toc215561186"/>
+      <w:r>
+        <w:rPr>
+          <w:b/>
+          <w:bCs/>
+        </w:rPr>
+        <w:t xml:space="preserve">Ilustración </w:t>
+      </w:r>
+      <w:r>
+        <w:rPr>
+          <w:b/>
+          <w:bCs/>
+        </w:rPr>
+        <w:fldChar w:fldCharType="begin"/>
+      </w:r>
+      <w:r>
+        <w:rPr>
+          <w:b/>
+          <w:bCs/>
+        </w:rPr>
+        <w:instrText xml:space="preserve"> SEQ Ilustración \* ARABIC </w:instrText>
+      </w:r>
+      <w:r>
+        <w:rPr>
+          <w:b/>
+          <w:bCs/>
+        </w:rPr>
+        <w:fldChar w:fldCharType="separate"/>
+      </w:r>
+      <w:r>
+        <w:rPr>
+          <w:b/>
+          <w:bCs/>
+          <w:noProof/>
+        </w:rPr>
+        <w:t>1</w:t>
+      </w:r>
+      <w:r>
+        <w:rPr>
+          <w:b/>
+          <w:bCs/>
+        </w:rPr>
+        <w:fldChar w:fldCharType="end"/>
+      </w:r>
+      <w:r>
+        <w:rPr>
+          <w:b/>
+          <w:bCs/>
+        </w:rPr>
+        <w:t>.</w:t>
+      </w:r>
+      <w:r>
+        <w:t xml:space="preserve"> </w:t>
+      </w:r>
+      <w:r>
+        <w:t>Organización de tareas y Sprints en la herramienta de gestión.</w:t>
+      </w:r>
+      <w:bookmarkEnd w:id="33"/>
+    </w:p>
+    <w:p>
+      <w:pPr>
+        <w:pStyle w:val="Ttulo2"/>
+      </w:pPr>
+      <w:bookmarkStart w:id="34" w:name="_Toc215211646"/>
+      <w:bookmarkStart w:id="35" w:name="_Toc215559175"/>
+      <w:r>
+        <w:t>Planificación temporal de tareas</w:t>
+      </w:r>
+      <w:bookmarkEnd w:id="34"/>
+      <w:bookmarkEnd w:id="35"/>
+    </w:p>
+    <w:p>
+      <w:pPr>
+        <w:ind w:start="42.50pt" w:end="35.45pt"/>
+        <w:jc w:val="both"/>
+        <w:rPr>
+          <w:rFonts w:ascii="Arial" w:eastAsia="Times New Roman" w:hAnsi="Arial" w:cs="Arial"/>
+          <w:kern w:val="0"/>
+          <w:lang w:eastAsia="es-ES" w:bidi="ar-SA"/>
+        </w:rPr>
+      </w:pPr>
+      <w:r>
+        <w:rPr>
+          <w:rFonts w:ascii="Arial" w:eastAsia="Times New Roman" w:hAnsi="Arial" w:cs="Arial"/>
+          <w:kern w:val="0"/>
+          <w:lang w:eastAsia="es-ES" w:bidi="ar-SA"/>
+        </w:rPr>
+        <w:t xml:space="preserve">La planificación temporal sigue un enfoque iterativo. A </w:t>
+      </w:r>
+      <w:r>
+        <w:rPr>
+          <w:rFonts w:ascii="Arial" w:eastAsia="Times New Roman" w:hAnsi="Arial" w:cs="Arial"/>
+          <w:kern w:val="0"/>
+          <w:lang w:eastAsia="es-ES" w:bidi="ar-SA"/>
+        </w:rPr>
+        <w:t>continuación,</w:t>
+      </w:r>
+      <w:r>
+        <w:rPr>
+          <w:rFonts w:ascii="Arial" w:eastAsia="Times New Roman" w:hAnsi="Arial" w:cs="Arial"/>
+          <w:kern w:val="0"/>
+          <w:lang w:eastAsia="es-ES" w:bidi="ar-SA"/>
+        </w:rPr>
+        <w:t xml:space="preserve"> se detalla el cronograma por fases:</w:t>
       </w:r>
     </w:p>
     <w:p>
@@ -13365,6 +14593,7 @@
           <w:kern w:val="0"/>
           <w:lang w:eastAsia="es-ES" w:bidi="ar-SA"/>
         </w:rPr>
+        <w:lastRenderedPageBreak/>
         <w:t>Fase de Inicio (Semanas 1-3): Configuración del entorno, definición de requisitos, diseño de BBDD y arquitectura MVC.</w:t>
       </w:r>
     </w:p>
@@ -13443,7 +14672,7 @@
           <w:kern w:val="0"/>
           <w:lang w:eastAsia="es-ES" w:bidi="ar-SA"/>
         </w:rPr>
-        <w:t>Sprint 3 - Gestión y Soporte (Semanas 11-13): Panel de administración, chat de soporte y sistema de notificaciones.</w:t>
+        <w:t>Sprint 3 - Gestión y Soporte (Semanas 11-13): Panel de administración, chat de soporte y sistema de notificaciones. Cierre y Optimización (Semanas 14-16): Mejoras de seguridad (2FA), optimización de rendimiento, pruebas finales y despliegue.</w:t>
       </w:r>
     </w:p>
     <w:p>
@@ -13469,107 +14698,182 @@
           <w:kern w:val="0"/>
           <w:lang w:eastAsia="es-ES" w:bidi="ar-SA"/>
         </w:rPr>
-        <w:t>Sprint 4 - Cierre y Optimización (Semanas 14-16): Mejoras de seguridad (2FA), optimización de rendimiento, pruebas finales y despliegue.</w:t>
+        <w:t>Documentación (Semana 17): Elaboración de manuales y memoria final.</w:t>
+      </w:r>
+      <w:r>
+        <w:rPr>
+          <w:rFonts w:ascii="Arial" w:eastAsia="Times New Roman" w:hAnsi="Arial" w:cs="Arial"/>
+          <w:noProof/>
+          <w:kern w:val="0"/>
+          <w:lang w:eastAsia="es-ES" w:bidi="ar-SA"/>
+        </w:rPr>
+        <w:t xml:space="preserve"> </w:t>
       </w:r>
     </w:p>
     <w:p>
       <w:pPr>
-        <w:numPr>
-          <w:ilvl w:val="0"/>
-          <w:numId w:val="36"/>
-        </w:numPr>
-        <w:tabs>
-          <w:tab w:val="num" w:pos="36pt"/>
-        </w:tabs>
-        <w:ind w:start="42.50pt" w:end="35.45pt"/>
-        <w:jc w:val="both"/>
+        <w:keepNext/>
+        <w:ind w:start="24.50pt" w:end="35.45pt"/>
+      </w:pPr>
+      <w:r>
+        <w:rPr>
+          <w:rFonts w:ascii="Arial" w:eastAsia="Times New Roman" w:hAnsi="Arial" w:cs="Arial"/>
+          <w:noProof/>
+          <w:kern w:val="0"/>
+          <w:lang w:eastAsia="es-ES" w:bidi="ar-SA"/>
+        </w:rPr>
+        <w:drawing>
+          <wp:inline distT="0" distB="0" distL="0" distR="0" wp14:anchorId="4E3BDE82" wp14:editId="67F04452">
+            <wp:extent cx="6337426" cy="1379855"/>
+            <wp:effectExtent l="0" t="0" r="6350" b="0"/>
+            <wp:docPr id="2001172413" name="Imagen 1"/>
+            <wp:cNvGraphicFramePr>
+              <a:graphicFrameLocks xmlns:a="http://purl.oclc.org/ooxml/drawingml/main" noChangeAspect="1"/>
+            </wp:cNvGraphicFramePr>
+            <a:graphic xmlns:a="http://purl.oclc.org/ooxml/drawingml/main">
+              <a:graphicData uri="http://purl.oclc.org/ooxml/drawingml/picture">
+                <pic:pic xmlns:pic="http://purl.oclc.org/ooxml/drawingml/picture">
+                  <pic:nvPicPr>
+                    <pic:cNvPr id="2001172413" name=""/>
+                    <pic:cNvPicPr/>
+                  </pic:nvPicPr>
+                  <pic:blipFill>
+                    <a:blip r:embed="rId13"/>
+                    <a:stretch>
+                      <a:fillRect/>
+                    </a:stretch>
+                  </pic:blipFill>
+                  <pic:spPr>
+                    <a:xfrm>
+                      <a:off x="0" y="0"/>
+                      <a:ext cx="6337892" cy="1379956"/>
+                    </a:xfrm>
+                    <a:prstGeom prst="rect">
+                      <a:avLst/>
+                    </a:prstGeom>
+                  </pic:spPr>
+                </pic:pic>
+              </a:graphicData>
+            </a:graphic>
+          </wp:inline>
+        </w:drawing>
+      </w:r>
+    </w:p>
+    <w:p>
+      <w:pPr>
+        <w:pStyle w:val="Descripcin"/>
+        <w:jc w:val="end"/>
         <w:rPr>
           <w:rFonts w:ascii="Arial" w:eastAsia="Times New Roman" w:hAnsi="Arial" w:cs="Arial"/>
           <w:kern w:val="0"/>
           <w:lang w:eastAsia="es-ES" w:bidi="ar-SA"/>
         </w:rPr>
       </w:pPr>
-      <w:r>
+      <w:bookmarkStart w:id="36" w:name="_Toc215561187"/>
+      <w:r>
+        <w:rPr>
+          <w:b/>
+          <w:bCs/>
+        </w:rPr>
+        <w:t xml:space="preserve">Ilustración </w:t>
+      </w:r>
+      <w:r>
+        <w:rPr>
+          <w:b/>
+          <w:bCs/>
+        </w:rPr>
+        <w:fldChar w:fldCharType="begin"/>
+      </w:r>
+      <w:r>
+        <w:rPr>
+          <w:b/>
+          <w:bCs/>
+        </w:rPr>
+        <w:instrText xml:space="preserve"> SEQ Ilustración \* ARABIC </w:instrText>
+      </w:r>
+      <w:r>
+        <w:rPr>
+          <w:b/>
+          <w:bCs/>
+        </w:rPr>
+        <w:fldChar w:fldCharType="separate"/>
+      </w:r>
+      <w:r>
+        <w:rPr>
+          <w:b/>
+          <w:bCs/>
+          <w:noProof/>
+        </w:rPr>
+        <w:t>2</w:t>
+      </w:r>
+      <w:r>
+        <w:rPr>
+          <w:b/>
+          <w:bCs/>
+        </w:rPr>
+        <w:fldChar w:fldCharType="end"/>
+      </w:r>
+      <w:r>
+        <w:rPr>
+          <w:b/>
+          <w:bCs/>
+        </w:rPr>
+        <w:t>.</w:t>
+      </w:r>
+      <w:r>
+        <w:t xml:space="preserve"> </w:t>
+      </w:r>
+      <w:r>
+        <w:t>Cronograma temporal de fases del proyecto Lectio.</w:t>
+      </w:r>
+      <w:bookmarkEnd w:id="36"/>
+    </w:p>
+    <w:p>
+      <w:pPr>
+        <w:pStyle w:val="Ttulo2"/>
+      </w:pPr>
+      <w:bookmarkStart w:id="37" w:name="_Toc215211647"/>
+      <w:bookmarkStart w:id="38" w:name="_Toc215559176"/>
+      <w:r>
+        <w:t>Presupuesto</w:t>
+      </w:r>
+      <w:bookmarkEnd w:id="37"/>
+      <w:bookmarkEnd w:id="38"/>
+    </w:p>
+    <w:p>
+      <w:pPr>
+        <w:ind w:start="42.50pt" w:end="35.45pt"/>
+        <w:jc w:val="both"/>
         <w:rPr>
           <w:rFonts w:ascii="Arial" w:eastAsia="Times New Roman" w:hAnsi="Arial" w:cs="Arial"/>
           <w:kern w:val="0"/>
           <w:lang w:eastAsia="es-ES" w:bidi="ar-SA"/>
         </w:rPr>
-        <w:t>Documentación (Semana 17): Elaboración de manuales y memoria final.</w:t>
-      </w:r>
-    </w:p>
-    <w:p>
-      <w:pPr>
-        <w:pStyle w:val="Ttulo2"/>
-      </w:pPr>
-      <w:bookmarkStart w:id="17" w:name="_Toc215211647"/>
-      <w:r>
-        <w:t>Presupuesto</w:t>
-      </w:r>
-      <w:bookmarkEnd w:id="17"/>
-    </w:p>
-    <w:p>
-      <w:pPr>
-        <w:ind w:start="42.50pt" w:end="35.45pt"/>
-        <w:jc w:val="both"/>
+      </w:pPr>
+      <w:r>
         <w:rPr>
           <w:rFonts w:ascii="Arial" w:eastAsia="Times New Roman" w:hAnsi="Arial" w:cs="Arial"/>
           <w:kern w:val="0"/>
           <w:lang w:eastAsia="es-ES" w:bidi="ar-SA"/>
         </w:rPr>
-      </w:pPr>
-      <w:r>
+        <w:t>El presupuesto se ha calculado considerando costes fijos, licencias y personal para un desarrollo estimado de 4 meses.</w:t>
+      </w:r>
+    </w:p>
+    <w:p>
+      <w:pPr>
+        <w:ind w:start="42.50pt" w:end="35.45pt"/>
+        <w:jc w:val="both"/>
         <w:rPr>
           <w:rFonts w:ascii="Arial" w:eastAsia="Times New Roman" w:hAnsi="Arial" w:cs="Arial"/>
           <w:kern w:val="0"/>
           <w:lang w:eastAsia="es-ES" w:bidi="ar-SA"/>
         </w:rPr>
-        <w:t>El presupuesto se ha calculado considerando costes fijos, licencias y personal para un desarrollo estimado de 4 meses.</w:t>
-      </w:r>
-    </w:p>
-    <w:p>
-      <w:pPr>
-        <w:widowControl/>
-        <w:suppressAutoHyphens w:val="0"/>
-        <w:rPr>
-          <w:rFonts w:ascii="Arial" w:eastAsia="Times New Roman" w:hAnsi="Arial" w:cs="Arial"/>
-          <w:kern w:val="0"/>
-          <w:lang w:eastAsia="es-ES" w:bidi="ar-SA"/>
-        </w:rPr>
-      </w:pPr>
-      <w:r>
-        <w:rPr>
-          <w:rFonts w:ascii="Arial" w:eastAsia="Times New Roman" w:hAnsi="Arial" w:cs="Arial"/>
-          <w:kern w:val="0"/>
-          <w:lang w:eastAsia="es-ES" w:bidi="ar-SA"/>
-        </w:rPr>
-        <w:br w:type="page"/>
-      </w:r>
-    </w:p>
-    <w:p>
-      <w:pPr>
-        <w:ind w:start="36pt"/>
-        <w:jc w:val="both"/>
-        <w:rPr>
-          <w:rFonts w:ascii="Arial" w:eastAsia="Times New Roman" w:hAnsi="Arial" w:cs="Arial"/>
-          <w:kern w:val="0"/>
-          <w:lang w:eastAsia="es-ES" w:bidi="ar-SA"/>
-        </w:rPr>
-      </w:pPr>
-      <w:r>
-        <w:rPr>
-          <w:rFonts w:ascii="Arial" w:eastAsia="Times New Roman" w:hAnsi="Arial" w:cs="Arial"/>
-          <w:kern w:val="0"/>
-          <w:lang w:eastAsia="es-ES" w:bidi="ar-SA"/>
-        </w:rPr>
-        <w:lastRenderedPageBreak/>
-        <w:t>Tabla de Costes</w:t>
-      </w:r>
+      </w:pPr>
     </w:p>
     <w:tbl>
       <w:tblPr>
         <w:tblStyle w:val="Tablaconcuadrcula"/>
-        <w:tblW w:w="518.90pt" w:type="dxa"/>
+        <w:tblW w:w="504.70pt" w:type="dxa"/>
         <w:tblInd w:w="12.45pt" w:type="dxa"/>
         <w:tblBorders>
           <w:top w:val="single" w:sz="4" w:space="0" w:color="4472C4" w:themeColor="accent1"/>
@@ -13588,7 +14892,7 @@
         <w:gridCol w:w="1701"/>
         <w:gridCol w:w="1701"/>
         <w:gridCol w:w="1701"/>
-        <w:gridCol w:w="1701"/>
+        <w:gridCol w:w="1417"/>
       </w:tblGrid>
       <w:tr>
         <w:tc>
@@ -13678,12 +14982,21 @@
                 <w:szCs w:val="24"/>
               </w:rPr>
             </w:pPr>
-            <w:r>
-              <w:rPr>
-                <w:rFonts w:asciiTheme="minorHAnsi" w:hAnsiTheme="minorHAnsi" w:cstheme="minorHAnsi"/>
-                <w:szCs w:val="24"/>
-              </w:rPr>
-              <w:t>Total bruto</w:t>
+            <w:proofErr w:type="gramStart"/>
+            <w:r>
+              <w:rPr>
+                <w:rFonts w:asciiTheme="minorHAnsi" w:hAnsiTheme="minorHAnsi" w:cstheme="minorHAnsi"/>
+                <w:szCs w:val="24"/>
+              </w:rPr>
+              <w:t>Total</w:t>
+            </w:r>
+            <w:proofErr w:type="gramEnd"/>
+            <w:r>
+              <w:rPr>
+                <w:rFonts w:asciiTheme="minorHAnsi" w:hAnsiTheme="minorHAnsi" w:cstheme="minorHAnsi"/>
+                <w:szCs w:val="24"/>
+              </w:rPr>
+              <w:t xml:space="preserve"> bruto</w:t>
             </w:r>
           </w:p>
         </w:tc>
@@ -13713,7 +15026,7 @@
         </w:tc>
         <w:tc>
           <w:tcPr>
-            <w:tcW w:w="85.05pt" w:type="dxa"/>
+            <w:tcW w:w="70.85pt" w:type="dxa"/>
             <w:shd w:val="clear" w:color="auto" w:fill="4F81BD"/>
             <w:vAlign w:val="center"/>
           </w:tcPr>
@@ -13726,12 +15039,21 @@
                 <w:szCs w:val="24"/>
               </w:rPr>
             </w:pPr>
-            <w:r>
-              <w:rPr>
-                <w:rFonts w:asciiTheme="minorHAnsi" w:hAnsiTheme="minorHAnsi" w:cstheme="minorHAnsi"/>
-                <w:szCs w:val="24"/>
-              </w:rPr>
-              <w:t>Total neto</w:t>
+            <w:proofErr w:type="gramStart"/>
+            <w:r>
+              <w:rPr>
+                <w:rFonts w:asciiTheme="minorHAnsi" w:hAnsiTheme="minorHAnsi" w:cstheme="minorHAnsi"/>
+                <w:szCs w:val="24"/>
+              </w:rPr>
+              <w:t>Total</w:t>
+            </w:r>
+            <w:proofErr w:type="gramEnd"/>
+            <w:r>
+              <w:rPr>
+                <w:rFonts w:asciiTheme="minorHAnsi" w:hAnsiTheme="minorHAnsi" w:cstheme="minorHAnsi"/>
+                <w:szCs w:val="24"/>
+              </w:rPr>
+              <w:t xml:space="preserve"> neto</w:t>
             </w:r>
           </w:p>
         </w:tc>
@@ -13854,7 +15176,7 @@
         </w:tc>
         <w:tc>
           <w:tcPr>
-            <w:tcW w:w="85.05pt" w:type="dxa"/>
+            <w:tcW w:w="70.85pt" w:type="dxa"/>
             <w:vAlign w:val="center"/>
           </w:tcPr>
           <w:p>
@@ -14001,7 +15323,7 @@
         </w:tc>
         <w:tc>
           <w:tcPr>
-            <w:tcW w:w="85.05pt" w:type="dxa"/>
+            <w:tcW w:w="70.85pt" w:type="dxa"/>
             <w:vAlign w:val="center"/>
           </w:tcPr>
           <w:p>
@@ -14148,7 +15470,7 @@
         </w:tc>
         <w:tc>
           <w:tcPr>
-            <w:tcW w:w="85.05pt" w:type="dxa"/>
+            <w:tcW w:w="70.85pt" w:type="dxa"/>
             <w:vAlign w:val="center"/>
           </w:tcPr>
           <w:p>
@@ -14288,7 +15610,7 @@
         </w:tc>
         <w:tc>
           <w:tcPr>
-            <w:tcW w:w="85.05pt" w:type="dxa"/>
+            <w:tcW w:w="70.85pt" w:type="dxa"/>
             <w:vAlign w:val="center"/>
           </w:tcPr>
           <w:p>
@@ -14325,12 +15647,21 @@
                 <w:szCs w:val="24"/>
               </w:rPr>
             </w:pPr>
-            <w:r>
-              <w:rPr>
-                <w:rFonts w:asciiTheme="minorHAnsi" w:hAnsiTheme="minorHAnsi" w:cstheme="minorHAnsi"/>
-                <w:szCs w:val="24"/>
-              </w:rPr>
-              <w:t>Total mensual</w:t>
+            <w:proofErr w:type="gramStart"/>
+            <w:r>
+              <w:rPr>
+                <w:rFonts w:asciiTheme="minorHAnsi" w:hAnsiTheme="minorHAnsi" w:cstheme="minorHAnsi"/>
+                <w:szCs w:val="24"/>
+              </w:rPr>
+              <w:t>Total</w:t>
+            </w:r>
+            <w:proofErr w:type="gramEnd"/>
+            <w:r>
+              <w:rPr>
+                <w:rFonts w:asciiTheme="minorHAnsi" w:hAnsiTheme="minorHAnsi" w:cstheme="minorHAnsi"/>
+                <w:szCs w:val="24"/>
+              </w:rPr>
+              <w:t xml:space="preserve"> mensual</w:t>
             </w:r>
           </w:p>
         </w:tc>
@@ -14400,12 +15731,13 @@
         </w:tc>
         <w:tc>
           <w:tcPr>
-            <w:tcW w:w="85.05pt" w:type="dxa"/>
-            <w:vAlign w:val="center"/>
-          </w:tcPr>
-          <w:p>
-            <w:pPr>
-              <w:pStyle w:val="NormalWeb"/>
+            <w:tcW w:w="70.85pt" w:type="dxa"/>
+            <w:vAlign w:val="center"/>
+          </w:tcPr>
+          <w:p>
+            <w:pPr>
+              <w:pStyle w:val="NormalWeb"/>
+              <w:keepNext/>
               <w:jc w:val="center"/>
               <w:rPr>
                 <w:rFonts w:asciiTheme="minorHAnsi" w:hAnsiTheme="minorHAnsi" w:cstheme="minorHAnsi"/>
@@ -14432,13 +15764,72 @@
     </w:tbl>
     <w:p>
       <w:pPr>
-        <w:jc w:val="both"/>
+        <w:pStyle w:val="Descripcin"/>
+        <w:jc w:val="end"/>
         <w:rPr>
           <w:rFonts w:ascii="Arial" w:eastAsia="Times New Roman" w:hAnsi="Arial" w:cs="Arial"/>
           <w:kern w:val="0"/>
           <w:lang w:eastAsia="es-ES" w:bidi="ar-SA"/>
         </w:rPr>
       </w:pPr>
+      <w:bookmarkStart w:id="39" w:name="_Toc215560162"/>
+      <w:r>
+        <w:rPr>
+          <w:b/>
+          <w:bCs/>
+        </w:rPr>
+        <w:t xml:space="preserve">Tabla </w:t>
+      </w:r>
+      <w:r>
+        <w:rPr>
+          <w:b/>
+          <w:bCs/>
+        </w:rPr>
+        <w:fldChar w:fldCharType="begin"/>
+      </w:r>
+      <w:r>
+        <w:rPr>
+          <w:b/>
+          <w:bCs/>
+        </w:rPr>
+        <w:instrText xml:space="preserve"> SEQ Tabla \* ARABIC </w:instrText>
+      </w:r>
+      <w:r>
+        <w:rPr>
+          <w:b/>
+          <w:bCs/>
+        </w:rPr>
+        <w:fldChar w:fldCharType="separate"/>
+      </w:r>
+      <w:r>
+        <w:rPr>
+          <w:b/>
+          <w:bCs/>
+          <w:noProof/>
+        </w:rPr>
+        <w:t>4</w:t>
+      </w:r>
+      <w:r>
+        <w:rPr>
+          <w:b/>
+          <w:bCs/>
+        </w:rPr>
+        <w:fldChar w:fldCharType="end"/>
+      </w:r>
+      <w:r>
+        <w:rPr>
+          <w:b/>
+          <w:bCs/>
+        </w:rPr>
+        <w:t>.</w:t>
+      </w:r>
+      <w:r>
+        <w:t xml:space="preserve"> </w:t>
+      </w:r>
+      <w:r>
+        <w:t>Costes fijos mensual</w:t>
+      </w:r>
+      <w:bookmarkEnd w:id="39"/>
     </w:p>
     <w:p>
       <w:pPr>
@@ -14773,12 +16164,21 @@
                 <w:szCs w:val="24"/>
               </w:rPr>
             </w:pPr>
-            <w:r>
-              <w:rPr>
-                <w:rFonts w:asciiTheme="minorHAnsi" w:hAnsiTheme="minorHAnsi" w:cstheme="minorHAnsi"/>
-                <w:szCs w:val="24"/>
-              </w:rPr>
-              <w:t>Total mensual</w:t>
+            <w:proofErr w:type="gramStart"/>
+            <w:r>
+              <w:rPr>
+                <w:rFonts w:asciiTheme="minorHAnsi" w:hAnsiTheme="minorHAnsi" w:cstheme="minorHAnsi"/>
+                <w:szCs w:val="24"/>
+              </w:rPr>
+              <w:t>Total</w:t>
+            </w:r>
+            <w:proofErr w:type="gramEnd"/>
+            <w:r>
+              <w:rPr>
+                <w:rFonts w:asciiTheme="minorHAnsi" w:hAnsiTheme="minorHAnsi" w:cstheme="minorHAnsi"/>
+                <w:szCs w:val="24"/>
+              </w:rPr>
+              <w:t xml:space="preserve"> mensual</w:t>
             </w:r>
           </w:p>
         </w:tc>
@@ -14806,6 +16206,7 @@
           <w:p>
             <w:pPr>
               <w:pStyle w:val="NormalWeb"/>
+              <w:keepNext/>
               <w:jc w:val="center"/>
               <w:rPr>
                 <w:rFonts w:asciiTheme="minorHAnsi" w:hAnsiTheme="minorHAnsi" w:cstheme="minorHAnsi"/>
@@ -14825,18 +16226,77 @@
     </w:tbl>
     <w:p>
       <w:pPr>
-        <w:jc w:val="both"/>
+        <w:pStyle w:val="Descripcin"/>
+        <w:jc w:val="end"/>
         <w:rPr>
           <w:rFonts w:ascii="Arial" w:eastAsia="Times New Roman" w:hAnsi="Arial" w:cs="Arial"/>
           <w:kern w:val="0"/>
           <w:lang w:eastAsia="es-ES" w:bidi="ar-SA"/>
         </w:rPr>
       </w:pPr>
+      <w:bookmarkStart w:id="40" w:name="_Toc215560163"/>
+      <w:r>
+        <w:rPr>
+          <w:b/>
+          <w:bCs/>
+        </w:rPr>
+        <w:t xml:space="preserve">Tabla </w:t>
+      </w:r>
+      <w:r>
+        <w:rPr>
+          <w:b/>
+          <w:bCs/>
+        </w:rPr>
+        <w:fldChar w:fldCharType="begin"/>
+      </w:r>
+      <w:r>
+        <w:rPr>
+          <w:b/>
+          <w:bCs/>
+        </w:rPr>
+        <w:instrText xml:space="preserve"> SEQ Tabla \* ARABIC </w:instrText>
+      </w:r>
+      <w:r>
+        <w:rPr>
+          <w:b/>
+          <w:bCs/>
+        </w:rPr>
+        <w:fldChar w:fldCharType="separate"/>
+      </w:r>
+      <w:r>
+        <w:rPr>
+          <w:b/>
+          <w:bCs/>
+          <w:noProof/>
+        </w:rPr>
+        <w:t>5</w:t>
+      </w:r>
+      <w:r>
+        <w:rPr>
+          <w:b/>
+          <w:bCs/>
+        </w:rPr>
+        <w:fldChar w:fldCharType="end"/>
+      </w:r>
+      <w:r>
+        <w:rPr>
+          <w:b/>
+          <w:bCs/>
+        </w:rPr>
+        <w:t>.</w:t>
+      </w:r>
+      <w:r>
+        <w:t xml:space="preserve"> </w:t>
+      </w:r>
+      <w:r>
+        <w:t>Costes fijos anuales</w:t>
+      </w:r>
+      <w:bookmarkEnd w:id="40"/>
     </w:p>
     <w:tbl>
       <w:tblPr>
         <w:tblStyle w:val="Tablaconcuadrcula"/>
-        <w:tblW w:w="518.90pt" w:type="dxa"/>
+        <w:tblW w:w="504.70pt" w:type="dxa"/>
         <w:tblInd w:w="12.45pt" w:type="dxa"/>
         <w:tblBorders>
           <w:top w:val="single" w:sz="4" w:space="0" w:color="4472C4" w:themeColor="accent1"/>
@@ -14855,7 +16315,7 @@
         <w:gridCol w:w="1701"/>
         <w:gridCol w:w="1701"/>
         <w:gridCol w:w="1701"/>
-        <w:gridCol w:w="1701"/>
+        <w:gridCol w:w="1417"/>
       </w:tblGrid>
       <w:tr>
         <w:tc>
@@ -14945,12 +16405,21 @@
                 <w:szCs w:val="24"/>
               </w:rPr>
             </w:pPr>
-            <w:r>
-              <w:rPr>
-                <w:rFonts w:asciiTheme="minorHAnsi" w:hAnsiTheme="minorHAnsi" w:cstheme="minorHAnsi"/>
-                <w:szCs w:val="24"/>
-              </w:rPr>
-              <w:t>Total bruto</w:t>
+            <w:proofErr w:type="gramStart"/>
+            <w:r>
+              <w:rPr>
+                <w:rFonts w:asciiTheme="minorHAnsi" w:hAnsiTheme="minorHAnsi" w:cstheme="minorHAnsi"/>
+                <w:szCs w:val="24"/>
+              </w:rPr>
+              <w:t>Total</w:t>
+            </w:r>
+            <w:proofErr w:type="gramEnd"/>
+            <w:r>
+              <w:rPr>
+                <w:rFonts w:asciiTheme="minorHAnsi" w:hAnsiTheme="minorHAnsi" w:cstheme="minorHAnsi"/>
+                <w:szCs w:val="24"/>
+              </w:rPr>
+              <w:t xml:space="preserve"> bruto</w:t>
             </w:r>
           </w:p>
         </w:tc>
@@ -14980,7 +16449,7 @@
         </w:tc>
         <w:tc>
           <w:tcPr>
-            <w:tcW w:w="85.05pt" w:type="dxa"/>
+            <w:tcW w:w="70.85pt" w:type="dxa"/>
             <w:shd w:val="clear" w:color="auto" w:fill="4F81BD"/>
             <w:vAlign w:val="center"/>
           </w:tcPr>
@@ -14993,12 +16462,21 @@
                 <w:szCs w:val="24"/>
               </w:rPr>
             </w:pPr>
-            <w:r>
-              <w:rPr>
-                <w:rFonts w:asciiTheme="minorHAnsi" w:hAnsiTheme="minorHAnsi" w:cstheme="minorHAnsi"/>
-                <w:szCs w:val="24"/>
-              </w:rPr>
-              <w:t>Total neto</w:t>
+            <w:proofErr w:type="gramStart"/>
+            <w:r>
+              <w:rPr>
+                <w:rFonts w:asciiTheme="minorHAnsi" w:hAnsiTheme="minorHAnsi" w:cstheme="minorHAnsi"/>
+                <w:szCs w:val="24"/>
+              </w:rPr>
+              <w:t>Total</w:t>
+            </w:r>
+            <w:proofErr w:type="gramEnd"/>
+            <w:r>
+              <w:rPr>
+                <w:rFonts w:asciiTheme="minorHAnsi" w:hAnsiTheme="minorHAnsi" w:cstheme="minorHAnsi"/>
+                <w:szCs w:val="24"/>
+              </w:rPr>
+              <w:t xml:space="preserve"> neto</w:t>
             </w:r>
           </w:p>
         </w:tc>
@@ -15046,7 +16524,14 @@
                 <w:rFonts w:asciiTheme="minorHAnsi" w:hAnsiTheme="minorHAnsi" w:cstheme="minorHAnsi"/>
                 <w:szCs w:val="24"/>
               </w:rPr>
-              <w:t>40 horas</w:t>
+              <w:t>220</w:t>
+            </w:r>
+            <w:r>
+              <w:rPr>
+                <w:rFonts w:asciiTheme="minorHAnsi" w:hAnsiTheme="minorHAnsi" w:cstheme="minorHAnsi"/>
+                <w:szCs w:val="24"/>
+              </w:rPr>
+              <w:t xml:space="preserve"> horas</w:t>
             </w:r>
           </w:p>
         </w:tc>
@@ -15092,7 +16577,14 @@
                 <w:rFonts w:asciiTheme="minorHAnsi" w:hAnsiTheme="minorHAnsi" w:cstheme="minorHAnsi"/>
                 <w:szCs w:val="24"/>
               </w:rPr>
-              <w:t>800,00 €</w:t>
+              <w:t>4400</w:t>
+            </w:r>
+            <w:r>
+              <w:rPr>
+                <w:rFonts w:asciiTheme="minorHAnsi" w:hAnsiTheme="minorHAnsi" w:cstheme="minorHAnsi"/>
+                <w:szCs w:val="24"/>
+              </w:rPr>
+              <w:t>,00 €</w:t>
             </w:r>
           </w:p>
         </w:tc>
@@ -15138,24 +16630,31 @@
         </w:tc>
         <w:tc>
           <w:tcPr>
-            <w:tcW w:w="85.05pt" w:type="dxa"/>
-            <w:vAlign w:val="center"/>
-          </w:tcPr>
-          <w:p>
-            <w:pPr>
-              <w:pStyle w:val="NormalWeb"/>
-              <w:jc w:val="center"/>
-              <w:rPr>
-                <w:rFonts w:asciiTheme="minorHAnsi" w:hAnsiTheme="minorHAnsi" w:cstheme="minorHAnsi"/>
-                <w:szCs w:val="24"/>
-              </w:rPr>
-            </w:pPr>
-            <w:r>
-              <w:rPr>
-                <w:rFonts w:asciiTheme="minorHAnsi" w:hAnsiTheme="minorHAnsi" w:cstheme="minorHAnsi"/>
-                <w:szCs w:val="24"/>
-              </w:rPr>
-              <w:t>520,00 €</w:t>
+            <w:tcW w:w="70.85pt" w:type="dxa"/>
+            <w:vAlign w:val="center"/>
+          </w:tcPr>
+          <w:p>
+            <w:pPr>
+              <w:pStyle w:val="NormalWeb"/>
+              <w:jc w:val="center"/>
+              <w:rPr>
+                <w:rFonts w:asciiTheme="minorHAnsi" w:hAnsiTheme="minorHAnsi" w:cstheme="minorHAnsi"/>
+                <w:szCs w:val="24"/>
+              </w:rPr>
+            </w:pPr>
+            <w:r>
+              <w:rPr>
+                <w:rFonts w:asciiTheme="minorHAnsi" w:hAnsiTheme="minorHAnsi" w:cstheme="minorHAnsi"/>
+                <w:szCs w:val="24"/>
+              </w:rPr>
+              <w:t>2860</w:t>
+            </w:r>
+            <w:r>
+              <w:rPr>
+                <w:rFonts w:asciiTheme="minorHAnsi" w:hAnsiTheme="minorHAnsi" w:cstheme="minorHAnsi"/>
+                <w:szCs w:val="24"/>
+              </w:rPr>
+              <w:t>,00 €</w:t>
             </w:r>
           </w:p>
         </w:tc>
@@ -15180,6 +16679,7 @@
                 <w:rFonts w:asciiTheme="minorHAnsi" w:hAnsiTheme="minorHAnsi" w:cstheme="minorHAnsi"/>
                 <w:szCs w:val="24"/>
               </w:rPr>
+              <w:lastRenderedPageBreak/>
               <w:t>Nómina diseñador</w:t>
             </w:r>
           </w:p>
@@ -15203,7 +16703,14 @@
                 <w:rFonts w:asciiTheme="minorHAnsi" w:hAnsiTheme="minorHAnsi" w:cstheme="minorHAnsi"/>
                 <w:szCs w:val="24"/>
               </w:rPr>
-              <w:t>10 horas</w:t>
+              <w:t>8</w:t>
+            </w:r>
+            <w:r>
+              <w:rPr>
+                <w:rFonts w:asciiTheme="minorHAnsi" w:hAnsiTheme="minorHAnsi" w:cstheme="minorHAnsi"/>
+                <w:szCs w:val="24"/>
+              </w:rPr>
+              <w:t>0 horas</w:t>
             </w:r>
           </w:p>
         </w:tc>
@@ -15249,7 +16756,14 @@
                 <w:rFonts w:asciiTheme="minorHAnsi" w:hAnsiTheme="minorHAnsi" w:cstheme="minorHAnsi"/>
                 <w:szCs w:val="24"/>
               </w:rPr>
-              <w:t>220,00 €</w:t>
+              <w:t>176</w:t>
+            </w:r>
+            <w:r>
+              <w:rPr>
+                <w:rFonts w:asciiTheme="minorHAnsi" w:hAnsiTheme="minorHAnsi" w:cstheme="minorHAnsi"/>
+                <w:szCs w:val="24"/>
+              </w:rPr>
+              <w:t>0,00 €</w:t>
             </w:r>
           </w:p>
         </w:tc>
@@ -15295,24 +16809,24 @@
         </w:tc>
         <w:tc>
           <w:tcPr>
-            <w:tcW w:w="85.05pt" w:type="dxa"/>
-            <w:vAlign w:val="center"/>
-          </w:tcPr>
-          <w:p>
-            <w:pPr>
-              <w:pStyle w:val="NormalWeb"/>
-              <w:jc w:val="center"/>
-              <w:rPr>
-                <w:rFonts w:asciiTheme="minorHAnsi" w:hAnsiTheme="minorHAnsi" w:cstheme="minorHAnsi"/>
-                <w:szCs w:val="24"/>
-              </w:rPr>
-            </w:pPr>
-            <w:r>
-              <w:rPr>
-                <w:rFonts w:asciiTheme="minorHAnsi" w:hAnsiTheme="minorHAnsi" w:cstheme="minorHAnsi"/>
-                <w:szCs w:val="24"/>
-              </w:rPr>
-              <w:t>143,00 €</w:t>
+            <w:tcW w:w="70.85pt" w:type="dxa"/>
+            <w:vAlign w:val="center"/>
+          </w:tcPr>
+          <w:p>
+            <w:pPr>
+              <w:pStyle w:val="NormalWeb"/>
+              <w:jc w:val="center"/>
+              <w:rPr>
+                <w:rFonts w:asciiTheme="minorHAnsi" w:hAnsiTheme="minorHAnsi" w:cstheme="minorHAnsi"/>
+                <w:szCs w:val="24"/>
+              </w:rPr>
+            </w:pPr>
+            <w:r>
+              <w:rPr>
+                <w:rFonts w:asciiTheme="minorHAnsi" w:hAnsiTheme="minorHAnsi" w:cstheme="minorHAnsi"/>
+                <w:szCs w:val="24"/>
+              </w:rPr>
+              <w:t>1144,00 €</w:t>
             </w:r>
           </w:p>
         </w:tc>
@@ -15337,7 +16851,7 @@
                 <w:rFonts w:asciiTheme="minorHAnsi" w:hAnsiTheme="minorHAnsi" w:cstheme="minorHAnsi"/>
                 <w:szCs w:val="24"/>
               </w:rPr>
-              <w:t>Total mensual</w:t>
+              <w:t>Total</w:t>
             </w:r>
           </w:p>
         </w:tc>
@@ -15407,24 +16921,39 @@
         </w:tc>
         <w:tc>
           <w:tcPr>
-            <w:tcW w:w="85.05pt" w:type="dxa"/>
-            <w:vAlign w:val="center"/>
-          </w:tcPr>
-          <w:p>
-            <w:pPr>
-              <w:pStyle w:val="NormalWeb"/>
-              <w:jc w:val="center"/>
-              <w:rPr>
-                <w:rFonts w:asciiTheme="minorHAnsi" w:hAnsiTheme="minorHAnsi" w:cstheme="minorHAnsi"/>
-                <w:szCs w:val="24"/>
-              </w:rPr>
-            </w:pPr>
-            <w:r>
-              <w:rPr>
-                <w:rFonts w:asciiTheme="minorHAnsi" w:hAnsiTheme="minorHAnsi" w:cstheme="minorHAnsi"/>
-                <w:szCs w:val="24"/>
-              </w:rPr>
-              <w:t>663,00 €</w:t>
+            <w:tcW w:w="70.85pt" w:type="dxa"/>
+            <w:vAlign w:val="center"/>
+          </w:tcPr>
+          <w:p>
+            <w:pPr>
+              <w:pStyle w:val="NormalWeb"/>
+              <w:keepNext/>
+              <w:jc w:val="center"/>
+              <w:rPr>
+                <w:rFonts w:asciiTheme="minorHAnsi" w:hAnsiTheme="minorHAnsi" w:cstheme="minorHAnsi"/>
+                <w:szCs w:val="24"/>
+              </w:rPr>
+            </w:pPr>
+            <w:r>
+              <w:rPr>
+                <w:rFonts w:asciiTheme="minorHAnsi" w:hAnsiTheme="minorHAnsi" w:cstheme="minorHAnsi"/>
+                <w:szCs w:val="24"/>
+              </w:rPr>
+              <w:t>40</w:t>
+            </w:r>
+            <w:r>
+              <w:rPr>
+                <w:rFonts w:asciiTheme="minorHAnsi" w:hAnsiTheme="minorHAnsi" w:cstheme="minorHAnsi"/>
+                <w:szCs w:val="24"/>
+              </w:rPr>
+              <w:t>04</w:t>
+            </w:r>
+            <w:r>
+              <w:rPr>
+                <w:rFonts w:asciiTheme="minorHAnsi" w:hAnsiTheme="minorHAnsi" w:cstheme="minorHAnsi"/>
+                <w:szCs w:val="24"/>
+              </w:rPr>
+              <w:t>,00 €</w:t>
             </w:r>
           </w:p>
         </w:tc>
@@ -15432,13 +16961,72 @@
     </w:tbl>
     <w:p>
       <w:pPr>
-        <w:jc w:val="both"/>
+        <w:pStyle w:val="Descripcin"/>
+        <w:jc w:val="end"/>
         <w:rPr>
           <w:rFonts w:ascii="Arial" w:eastAsia="Times New Roman" w:hAnsi="Arial" w:cs="Arial"/>
           <w:kern w:val="0"/>
           <w:lang w:eastAsia="es-ES" w:bidi="ar-SA"/>
         </w:rPr>
       </w:pPr>
+      <w:bookmarkStart w:id="41" w:name="_Toc215560164"/>
+      <w:r>
+        <w:rPr>
+          <w:b/>
+          <w:bCs/>
+        </w:rPr>
+        <w:t xml:space="preserve">Tabla </w:t>
+      </w:r>
+      <w:r>
+        <w:rPr>
+          <w:b/>
+          <w:bCs/>
+        </w:rPr>
+        <w:fldChar w:fldCharType="begin"/>
+      </w:r>
+      <w:r>
+        <w:rPr>
+          <w:b/>
+          <w:bCs/>
+        </w:rPr>
+        <w:instrText xml:space="preserve"> SEQ Tabla \* ARABIC </w:instrText>
+      </w:r>
+      <w:r>
+        <w:rPr>
+          <w:b/>
+          <w:bCs/>
+        </w:rPr>
+        <w:fldChar w:fldCharType="separate"/>
+      </w:r>
+      <w:r>
+        <w:rPr>
+          <w:b/>
+          <w:bCs/>
+          <w:noProof/>
+        </w:rPr>
+        <w:t>6</w:t>
+      </w:r>
+      <w:r>
+        <w:rPr>
+          <w:b/>
+          <w:bCs/>
+        </w:rPr>
+        <w:fldChar w:fldCharType="end"/>
+      </w:r>
+      <w:r>
+        <w:rPr>
+          <w:b/>
+          <w:bCs/>
+        </w:rPr>
+        <w:t>.</w:t>
+      </w:r>
+      <w:r>
+        <w:t xml:space="preserve"> </w:t>
+      </w:r>
+      <w:r>
+        <w:t>Costes variables</w:t>
+      </w:r>
+      <w:bookmarkEnd w:id="41"/>
     </w:p>
     <w:p>
       <w:pPr>
@@ -15455,7 +17043,8 @@
       <w:pPr>
         <w:pStyle w:val="Ttulo2"/>
       </w:pPr>
-      <w:bookmarkStart w:id="18" w:name="_Toc215211648"/>
+      <w:bookmarkStart w:id="42" w:name="_Toc215211648"/>
+      <w:bookmarkStart w:id="43" w:name="_Toc215559177"/>
       <w:r>
         <w:t xml:space="preserve">Contrato y pliego de condiciones </w:t>
       </w:r>
@@ -15465,7 +17054,8 @@
       <w:r>
         <w:t xml:space="preserve"> Licencia de distribución</w:t>
       </w:r>
-      <w:bookmarkEnd w:id="18"/>
+      <w:bookmarkEnd w:id="42"/>
+      <w:bookmarkEnd w:id="43"/>
     </w:p>
     <w:p>
       <w:pPr>
@@ -15514,7 +17104,23 @@
           <w:rFonts w:asciiTheme="minorHAnsi" w:hAnsiTheme="minorHAnsi" w:cstheme="minorHAnsi"/>
           <w:lang w:eastAsia="es-ES" w:bidi="ar-SA"/>
         </w:rPr>
-        <w:t xml:space="preserve">A continuación se detalla el </w:t>
+        <w:t xml:space="preserve">A </w:t>
+      </w:r>
+      <w:proofErr w:type="gramStart"/>
+      <w:r>
+        <w:rPr>
+          <w:rFonts w:asciiTheme="minorHAnsi" w:hAnsiTheme="minorHAnsi" w:cstheme="minorHAnsi"/>
+          <w:lang w:eastAsia="es-ES" w:bidi="ar-SA"/>
+        </w:rPr>
+        <w:t>continuación</w:t>
+      </w:r>
+      <w:proofErr w:type="gramEnd"/>
+      <w:r>
+        <w:rPr>
+          <w:rFonts w:asciiTheme="minorHAnsi" w:hAnsiTheme="minorHAnsi" w:cstheme="minorHAnsi"/>
+          <w:lang w:eastAsia="es-ES" w:bidi="ar-SA"/>
+        </w:rPr>
+        <w:t xml:space="preserve"> se detalla el </w:t>
       </w:r>
       <w:r>
         <w:rPr>
@@ -15626,17 +17232,6 @@
     </w:p>
     <w:p>
       <w:pPr>
-        <w:pStyle w:val="Prrafodelista"/>
-        <w:ind w:start="78.50pt" w:end="35.45pt"/>
-        <w:jc w:val="both"/>
-        <w:rPr>
-          <w:rFonts w:asciiTheme="minorHAnsi" w:hAnsiTheme="minorHAnsi" w:cstheme="minorHAnsi"/>
-          <w:lang w:eastAsia="es-ES" w:bidi="ar-SA"/>
-        </w:rPr>
-      </w:pPr>
-    </w:p>
-    <w:p>
-      <w:pPr>
         <w:ind w:start="42.50pt" w:end="35.45pt"/>
         <w:jc w:val="both"/>
         <w:rPr>
@@ -15653,7 +17248,6 @@
           <w:bCs/>
           <w:lang w:eastAsia="es-ES" w:bidi="ar-SA"/>
         </w:rPr>
-        <w:lastRenderedPageBreak/>
         <w:t>2. Propiedad Intelectual y Derechos de Autor</w:t>
       </w:r>
     </w:p>
@@ -15942,7 +17536,15 @@
           <w:rFonts w:asciiTheme="minorHAnsi" w:hAnsiTheme="minorHAnsi" w:cstheme="minorHAnsi"/>
           <w:lang w:eastAsia="es-ES" w:bidi="ar-SA"/>
         </w:rPr>
-        <w:t xml:space="preserve"> El Licenciatario garantiza que posee los derechos de distribución o venta de los libros digitales y físicos que cargue en la plataforma, eximiendo a Lectio de cualquier responsabilidad por infracción de derechos de autor de terceros.</w:t>
+        <w:t xml:space="preserve"> El Licenciatario garantiza que posee los derechos de </w:t>
+      </w:r>
+      <w:r>
+        <w:rPr>
+          <w:rFonts w:asciiTheme="minorHAnsi" w:hAnsiTheme="minorHAnsi" w:cstheme="minorHAnsi"/>
+          <w:lang w:eastAsia="es-ES" w:bidi="ar-SA"/>
+        </w:rPr>
+        <w:lastRenderedPageBreak/>
+        <w:t>distribución o venta de los libros digitales y físicos que cargue en la plataforma, eximiendo a Lectio de cualquier responsabilidad por infracción de derechos de autor de terceros.</w:t>
       </w:r>
     </w:p>
     <w:p>
@@ -16125,19 +17727,9 @@
         <w:t>Esta licencia será efectiva hasta su terminación. Los derechos del Licenciatario bajo esta licencia terminarán automáticamente sin previo aviso si incumple cualquiera de los términos especificados. A la terminación, el Licenciatario deberá dejar de usar el software y destruir todas las copias del mismo.</w:t>
       </w:r>
     </w:p>
-    <w:p>
-      <w:pPr>
-        <w:ind w:start="28.35pt"/>
-        <w:jc w:val="both"/>
-        <w:rPr>
-          <w:rFonts w:asciiTheme="minorHAnsi" w:hAnsiTheme="minorHAnsi" w:cstheme="minorHAnsi"/>
-          <w:lang w:eastAsia="es-ES" w:bidi="ar-SA"/>
-        </w:rPr>
-      </w:pPr>
-    </w:p>
     <w:sectPr>
-      <w:headerReference w:type="default" r:id="rId12"/>
-      <w:footerReference w:type="default" r:id="rId13"/>
+      <w:headerReference w:type="default" r:id="rId14"/>
+      <w:footerReference w:type="default" r:id="rId15"/>
       <w:pgSz w:w="595.30pt" w:h="841.90pt"/>
       <w:pgMar w:top="78pt" w:right="35.35pt" w:bottom="42.55pt" w:left="42.55pt" w:header="42.50pt" w:footer="28.35pt" w:gutter="0pt"/>
       <w:pgNumType w:start="0"/>
@@ -16482,7 +18074,7 @@
               <w:tab w:val="end" w:pos="425.20pt"/>
             </w:tabs>
             <w:snapToGrid w:val="0"/>
-            <w:ind w:end="-1.40pt"/>
+            <w:ind w:end="0.60pt"/>
             <w:contextualSpacing/>
             <w:jc w:val="center"/>
             <w:rPr>
@@ -24098,7 +25690,6 @@
     <w:basedOn w:val="Ttulo1"/>
     <w:next w:val="Normal"/>
     <w:uiPriority w:val="39"/>
-    <w:semiHidden/>
     <w:unhideWhenUsed/>
     <w:qFormat/>
     <w:rsid w:val="005C3339"/>
@@ -24309,6 +25900,77 @@
     <w:rPr>
       <w:color w:val="954F72" w:themeColor="followedHyperlink"/>
       <w:u w:val="single"/>
+    </w:rPr>
+  </w:style>
+  <w:style w:type="paragraph" w:styleId="TtuloTDC">
+    <w:name w:val="TOC Heading"/>
+    <w:basedOn w:val="Ttulo1"/>
+    <w:next w:val="Normal"/>
+    <w:uiPriority w:val="39"/>
+    <w:unhideWhenUsed/>
+    <w:qFormat/>
+    <w:rsid w:val="000C57C3"/>
+    <w:pPr>
+      <w:keepLines/>
+      <w:numPr>
+        <w:numId w:val="0"/>
+      </w:numPr>
+      <w:pBdr>
+        <w:bottom w:val="none" w:sz="0" w:space="0" w:color="auto"/>
+      </w:pBdr>
+      <w:spacing w:after="0pt" w:line="12.95pt" w:lineRule="auto"/>
+      <w:outlineLvl w:val="9"/>
+    </w:pPr>
+    <w:rPr>
+      <w:rFonts w:asciiTheme="majorHAnsi" w:eastAsiaTheme="majorEastAsia" w:hAnsiTheme="majorHAnsi" w:cstheme="majorBidi"/>
+      <w:b w:val="0"/>
+      <w:bCs w:val="0"/>
+      <w:color w:val="2F5496" w:themeColor="accent1" w:themeShade="BF"/>
+      <w:kern w:val="0"/>
+      <w:sz w:val="32"/>
+    </w:rPr>
+  </w:style>
+  <w:style w:type="character" w:styleId="Referenciasutil">
+    <w:name w:val="Subtle Reference"/>
+    <w:basedOn w:val="Fuentedeprrafopredeter"/>
+    <w:uiPriority w:val="31"/>
+    <w:qFormat/>
+    <w:rsid w:val="00984323"/>
+    <w:rPr>
+      <w:smallCaps/>
+      <w:color w:val="5A5A5A" w:themeColor="text1" w:themeTint="A5"/>
+    </w:rPr>
+  </w:style>
+  <w:style w:type="paragraph" w:styleId="Descripcin">
+    <w:name w:val="caption"/>
+    <w:basedOn w:val="Normal"/>
+    <w:next w:val="Normal"/>
+    <w:uiPriority w:val="35"/>
+    <w:qFormat/>
+    <w:rsid w:val="007B2839"/>
+    <w:pPr>
+      <w:spacing w:after="10pt"/>
+    </w:pPr>
+    <w:rPr>
+      <w:rFonts w:cs="Mangal"/>
+      <w:i/>
+      <w:iCs/>
+      <w:color w:val="44546A" w:themeColor="text2"/>
+      <w:sz w:val="18"/>
+      <w:szCs w:val="16"/>
+    </w:rPr>
+  </w:style>
+  <w:style w:type="paragraph" w:styleId="Tabladeilustraciones">
+    <w:name w:val="table of figures"/>
+    <w:aliases w:val="Índice de tablas"/>
+    <w:basedOn w:val="Normal"/>
+    <w:next w:val="Normal"/>
+    <w:uiPriority w:val="99"/>
+    <w:unhideWhenUsed/>
+    <w:rsid w:val="00F17E3A"/>
+    <w:rPr>
+      <w:rFonts w:ascii="Calibri" w:hAnsi="Calibri" w:cs="Mangal"/>
+      <w:szCs w:val="21"/>
     </w:rPr>
   </w:style>
 </w:styles>

</xml_diff>